<commit_message>
paper: Word manuscript rebuilt with all 18 references cited; table captions; STATUS
related_work.md cites every source with [Key] brackets (Gera18, Velicka26 added); Table 1-7
captions in the drafts; Fig. 1 caption without the regenerate note; loose lists keep one
numbering. lightbound_jsc.docx: 21 citation fields, 18 references in citation order.

Co-Authored-By: Claude Fable 5.1 <noreply@anthropic.com>
</commit_message>
<xml_diff>
--- a/docs/paper/lightbound_jsc.docx
+++ b/docs/paper/lightbound_jsc.docx
@@ -690,7 +690,25 @@
         <w:t xml:space="preserve">Unified memory doesn't remove synchronization cost; it moves it.</w:t>
       </w:r>
       <w:r>
-        <w:t xml:space="preserve"> Beischl26 measures this on Apple Silicon:</w:t>
+        <w:t xml:space="preserve"> Beischl et al. </w:t>
+      </w:r>
+      <w:r>
+        <w:fldChar w:fldCharType="begin"/>
+      </w:r>
+      <w:r>
+        <w:instrText xml:space="preserve"> ADDIN ZOTERO_ITEM CSL_CITATION {"citationID":"53e51abf","properties":{"formattedCitation":"[4]","plainCitation":"[4]","noteIndex":0},"citationItems":[{"id":"9RHUAUDT","uris":["http://zotero.org/users/5591478/items/9RHUAUDT"],"itemData":{"id":"9RHUAUDT","type":"paper-conference","collection-title":"DaMoN ’26","container-title":"Proceedings of the 22nd International Workshop on Data Management on New Hardware","DOI":"10.1145/3789237.3809127","note":"Citation Key: Beischl26","page":"1-10","publisher":"ACM","title":"Evaluating Apple Silicon for Data Processing","URL":"https://doi.org/10.1145/3789237.3809127","author":[{"family":"Beischl","given":"Alexander"},{"family":"Morozov","given":"Mykola"},{"family":"Jungmair","given":"Michael"},{"family":"Haussmann","given":"Lukas"},{"family":"Neumann","given":"Thomas"}],"issued":{"date-parts":[[2026,5]]}}}],"schema":"https://github.com/citation-style-language/schema/raw/master/csl-citation.json"} </w:instrText>
+      </w:r>
+      <w:r>
+        <w:fldChar w:fldCharType="separate"/>
+      </w:r>
+      <w:r>
+        <w:t xml:space="preserve">[4]</w:t>
+      </w:r>
+      <w:r>
+        <w:fldChar w:fldCharType="end"/>
+      </w:r>
+      <w:r>
+        <w:t xml:space="preserve"> measure this on Apple Silicon:</w:t>
       </w:r>
     </w:p>
     <w:p>
@@ -735,7 +753,43 @@
         <w:ind w:left="720"/>
       </w:pPr>
       <w:r>
-        <w:t xml:space="preserve">Wahlgren25 characterizes coherence overhead on MI300A's unified physical memory, and Spafford12 makes the same trade-off argument for early AMD APUs. Our M5 data agree: the cost sits in the hand-off, not in the bytes (Sect. 5).</w:t>
+        <w:t xml:space="preserve">Wahlgren et al. </w:t>
+      </w:r>
+      <w:r>
+        <w:fldChar w:fldCharType="begin"/>
+      </w:r>
+      <w:r>
+        <w:instrText xml:space="preserve"> ADDIN ZOTERO_ITEM CSL_CITATION {"citationID":"b76d4af3","properties":{"formattedCitation":"[2]","plainCitation":"[2]","noteIndex":0},"citationItems":[{"id":"Z6B26CZ6","uris":["http://zotero.org/users/5591478/items/Z6B26CZ6"],"itemData":{"id":"Z6B26CZ6","type":"paper-conference","container-title":"2025 IEEE International Symposium on Workload Characterization (IISWC)","DOI":"10.1109/iiswc66894.2025.00038","note":"Citation Key: Wahlgren25","page":"368-380","publisher":"IEEE","title":"Dissecting CPU-GPU Unified Physical Memory on AMD MI300A APUs","URL":"https://doi.org/10.1109/iiswc66894.2025.00038","author":[{"family":"Wahlgren","given":"Jacob"},{"family":"Schieffer","given":"Gabin"},{"family":"Shi","given":"Ruimin"},{"family":"León","given":"Edgar A."},{"family":"Pearce","given":"Roger"},{"family":"Gokhale","given":"Maya"},{"family":"Peng","given":"Ivy"}],"issued":{"date-parts":[[2025,10]]}}}],"schema":"https://github.com/citation-style-language/schema/raw/master/csl-citation.json"} </w:instrText>
+      </w:r>
+      <w:r>
+        <w:fldChar w:fldCharType="separate"/>
+      </w:r>
+      <w:r>
+        <w:t xml:space="preserve">[2]</w:t>
+      </w:r>
+      <w:r>
+        <w:fldChar w:fldCharType="end"/>
+      </w:r>
+      <w:r>
+        <w:t xml:space="preserve"> characterize coherence overhead on MI300A's unified physical memory, and Spafford et al. </w:t>
+      </w:r>
+      <w:r>
+        <w:fldChar w:fldCharType="begin"/>
+      </w:r>
+      <w:r>
+        <w:instrText xml:space="preserve"> ADDIN ZOTERO_ITEM CSL_CITATION {"citationID":"73727184","properties":{"formattedCitation":"[8]","plainCitation":"[8]","noteIndex":0},"citationItems":[{"id":"XFCXEPHQ","uris":["http://zotero.org/users/5591478/items/XFCXEPHQ"],"itemData":{"id":"XFCXEPHQ","type":"paper-conference","collection-title":"CF′12","container-title":"Proceedings of the 9th conference on Computing Frontiers","DOI":"10.1145/2212908.2212924","note":"Citation Key: Spafford12","page":"103-112","publisher":"ACM","title":"The tradeoffs of fused memory hierarchies in heterogeneous computing architectures","URL":"https://doi.org/10.1145/2212908.2212924","author":[{"family":"Spafford","given":"Kyle L."},{"family":"Meredith","given":"Jeremy S."},{"family":"Lee","given":"Seyong"},{"family":"Li","given":"Dong"},{"family":"Roth","given":"Philip C."},{"family":"Vetter","given":"Jeffrey S."}],"issued":{"date-parts":[[2012,5]]}}}],"schema":"https://github.com/citation-style-language/schema/raw/master/csl-citation.json"} </w:instrText>
+      </w:r>
+      <w:r>
+        <w:fldChar w:fldCharType="separate"/>
+      </w:r>
+      <w:r>
+        <w:t xml:space="preserve">[8]</w:t>
+      </w:r>
+      <w:r>
+        <w:fldChar w:fldCharType="end"/>
+      </w:r>
+      <w:r>
+        <w:t xml:space="preserve"> make the same trade-off argument for early AMD APUs. Our M5 data agree: the cost sits in the hand-off, not in the bytes (Sect. 5).</w:t>
       </w:r>
     </w:p>
     <w:p>
@@ -754,7 +808,61 @@
         <w:t xml:space="preserve">"Unified memory" means two different things.</w:t>
       </w:r>
       <w:r>
-        <w:t xml:space="preserve"> On discrete NVIDIA GPUs it is CUDA's managed memory: one address space, pages migrating over PCIe on demand. Its overhead against explicit copies is well measured, including in our target journal (Jarzabek17, Knap19, Yu20). Tightly coupled nodes remove the migration: Grace Hopper through a coherent link and one page table (Schieffer24), MI300A and Apple's SoCs through one physical memory (Wahlgren25, Huebner25, Beischl26). Our M5 is in the second group and our PCIe baseline uses explicit buffers, not CUDA UM, so the CUDA UM results are context, not a competing measurement.</w:t>
+        <w:t xml:space="preserve"> On discrete NVIDIA GPUs it is CUDA's managed memory: one address space, pages migrating over PCIe on demand. Its overhead against explicit copies is well measured, including in this journal </w:t>
+      </w:r>
+      <w:r>
+        <w:fldChar w:fldCharType="begin"/>
+      </w:r>
+      <w:r>
+        <w:instrText xml:space="preserve"> ADDIN ZOTERO_ITEM CSL_CITATION {"citationID":"70626b67","properties":{"formattedCitation":"[5–7]","plainCitation":"[5–7]","noteIndex":0},"citationItems":[{"id":"W5GC85GQ","uris":["http://zotero.org/users/5591478/items/W5GC85GQ"],"itemData":{"id":"W5GC85GQ","type":"article-journal","container-title":"The Journal of Supercomputing","DOI":"10.1007/s11227-019-02966-8","ISSN":"1573-0484","issue":"11","note":"Citation Key: Knap19","page":"7625-7645","title":"Performance evaluation of Unified Memory with prefetching and oversubscription for selected parallel CUDA applications on NVIDIA Pascal and Volta GPUs","URL":"https://doi.org/10.1007/s11227-019-02966-8","volume":"75","author":[{"family":"Knap","given":"Marcin"},{"family":"Czarnul","given":"Paweł"}],"issued":{"date-parts":[[2019,8]]}}},{"id":"VRGFJE8P","uris":["http://zotero.org/users/5591478/items/VRGFJE8P"],"itemData":{"id":"VRGFJE8P","type":"article-journal","container-title":"The Journal of Supercomputing","DOI":"10.1007/s11227-017-2091-x","ISSN":"1573-0484","issue":"12","note":"Citation Key: Jarzabek17","page":"5378-5401","title":"Performance evaluation of unified memory and dynamic parallelism for selected parallel CUDA applications","URL":"https://doi.org/10.1007/s11227-017-2091-x","volume":"73","author":[{"family":"Jarząbek","given":"Łukasz"},{"family":"Czarnul","given":"Paweł"}],"issued":{"date-parts":[[2017,6]]}}},{"id":"ZXCPKCWA","uris":["http://zotero.org/users/5591478/items/ZXCPKCWA"],"itemData":{"id":"ZXCPKCWA","type":"article-journal","container-title":"The Journal of Supercomputing","DOI":"10.1007/s11227-019-03079-y","ISSN":"1573-0484","issue":"4","note":"Citation Key: Yu20","page":"2958-2985","title":"A quantitative evaluation of unified memory in GPUs","URL":"https://doi.org/10.1007/s11227-019-03079-y","volume":"76","author":[{"family":"Yu","given":"Qi"},{"family":"Childers","given":"Bruce"},{"family":"Huang","given":"Libo"},{"family":"Qian","given":"Cheng"},{"family":"Wang","given":"Zhiying"}],"issued":{"date-parts":[[2020]]}}}],"schema":"https://github.com/citation-style-language/schema/raw/master/csl-citation.json"} </w:instrText>
+      </w:r>
+      <w:r>
+        <w:fldChar w:fldCharType="separate"/>
+      </w:r>
+      <w:r>
+        <w:t xml:space="preserve">[5–7]</w:t>
+      </w:r>
+      <w:r>
+        <w:fldChar w:fldCharType="end"/>
+      </w:r>
+      <w:r>
+        <w:t xml:space="preserve">. Tightly coupled nodes remove the migration: Grace Hopper through a coherent link and one page table </w:t>
+      </w:r>
+      <w:r>
+        <w:fldChar w:fldCharType="begin"/>
+      </w:r>
+      <w:r>
+        <w:instrText xml:space="preserve"> ADDIN ZOTERO_ITEM CSL_CITATION {"citationID":"66abc161","properties":{"formattedCitation":"[1]","plainCitation":"[1]","noteIndex":0},"citationItems":[{"id":"MF5ZZ8WX","uris":["http://zotero.org/users/5591478/items/MF5ZZ8WX"],"itemData":{"id":"MF5ZZ8WX","type":"paper-conference","collection-title":"ICPP ’24","container-title":"Proceedings of the 53rd International Conference on Parallel Processing","DOI":"10.1145/3673038.3673110","note":"Citation Key: Schieffer24","page":"199-209","publisher":"ACM","title":"Harnessing Integrated CPU-GPU System Memory for HPC: a first look into Grace Hopper","URL":"https://doi.org/10.1145/3673038.3673110","author":[{"family":"Schieffer","given":"Gabin"},{"family":"Wahlgren","given":"Jacob"},{"family":"Ren","given":"Jie"},{"family":"Faj","given":"Jennifer"},{"family":"Peng","given":"Ivy"}],"issued":{"date-parts":[[2024,8]]}}}],"schema":"https://github.com/citation-style-language/schema/raw/master/csl-citation.json"} </w:instrText>
+      </w:r>
+      <w:r>
+        <w:fldChar w:fldCharType="separate"/>
+      </w:r>
+      <w:r>
+        <w:t xml:space="preserve">[1]</w:t>
+      </w:r>
+      <w:r>
+        <w:fldChar w:fldCharType="end"/>
+      </w:r>
+      <w:r>
+        <w:t xml:space="preserve">, MI300A and Apple's SoCs through one physical memory </w:t>
+      </w:r>
+      <w:r>
+        <w:fldChar w:fldCharType="begin"/>
+      </w:r>
+      <w:r>
+        <w:instrText xml:space="preserve"> ADDIN ZOTERO_ITEM CSL_CITATION {"citationID":"b4bcae2c","properties":{"formattedCitation":"[2–4]","plainCitation":"[2–4]","noteIndex":0},"citationItems":[{"id":"Z6B26CZ6","uris":["http://zotero.org/users/5591478/items/Z6B26CZ6"],"itemData":{"id":"Z6B26CZ6","type":"paper-conference","container-title":"2025 IEEE International Symposium on Workload Characterization (IISWC)","DOI":"10.1109/iiswc66894.2025.00038","note":"Citation Key: Wahlgren25","page":"368-380","publisher":"IEEE","title":"Dissecting CPU-GPU Unified Physical Memory on AMD MI300A APUs","URL":"https://doi.org/10.1109/iiswc66894.2025.00038","author":[{"family":"Wahlgren","given":"Jacob"},{"family":"Schieffer","given":"Gabin"},{"family":"Shi","given":"Ruimin"},{"family":"León","given":"Edgar A."},{"family":"Pearce","given":"Roger"},{"family":"Gokhale","given":"Maya"},{"family":"Peng","given":"Ivy"}],"issued":{"date-parts":[[2025,10]]}}},{"id":"B5Q9E3C9","uris":["http://zotero.org/users/5591478/items/B5Q9E3C9"],"itemData":{"id":"B5Q9E3C9","type":"article","DOI":"10.48550/arXiv.2502.05317","note":"Citation Key: Huebner25","number":"arXiv:2502.05317","publisher":"arXiv","title":"Apple vs. Oranges: Evaluating the Apple Silicon M-Series SoCs for HPC Performance and Efficiency","URL":"https://arxiv.org/abs/2502.05317","author":[{"family":"Hübner","given":"Paul"},{"family":"Hu","given":"Andong"},{"family":"Peng","given":"Ivy"},{"family":"Markidis","given":"Stefano"}],"issued":{"date-parts":[[2025]]}}},{"id":"9RHUAUDT","uris":["http://zotero.org/users/5591478/items/9RHUAUDT"],"itemData":{"id":"9RHUAUDT","type":"paper-conference","collection-title":"DaMoN ’26","container-title":"Proceedings of the 22nd International Workshop on Data Management on New Hardware","DOI":"10.1145/3789237.3809127","note":"Citation Key: Beischl26","page":"1-10","publisher":"ACM","title":"Evaluating Apple Silicon for Data Processing","URL":"https://doi.org/10.1145/3789237.3809127","author":[{"family":"Beischl","given":"Alexander"},{"family":"Morozov","given":"Mykola"},{"family":"Jungmair","given":"Michael"},{"family":"Haussmann","given":"Lukas"},{"family":"Neumann","given":"Thomas"}],"issued":{"date-parts":[[2026,5]]}}}],"schema":"https://github.com/citation-style-language/schema/raw/master/csl-citation.json"} </w:instrText>
+      </w:r>
+      <w:r>
+        <w:fldChar w:fldCharType="separate"/>
+      </w:r>
+      <w:r>
+        <w:t xml:space="preserve">[2–4]</w:t>
+      </w:r>
+      <w:r>
+        <w:fldChar w:fldCharType="end"/>
+      </w:r>
+      <w:r>
+        <w:t xml:space="preserve">. Our M5 is in the second group and our PCIe baseline uses explicit buffers, not CUDA UM, so the CUDA UM results are context, not a competing measurement.</w:t>
       </w:r>
     </w:p>
     <w:p>
@@ -773,7 +881,43 @@
         <w:t xml:space="preserve">Copy vs zero-copy is workload-dependent</w:t>
       </w:r>
       <w:r>
-        <w:t xml:space="preserve"> (Lumpp21 on embedded iGPUs; Spafford12). Our Sect. 6 crossover measures that dependence directly in payload size and GPU state, on one benchmark that runs unchanged on both platforms.</w:t>
+        <w:t xml:space="preserve">, on embedded iGPUs </w:t>
+      </w:r>
+      <w:r>
+        <w:fldChar w:fldCharType="begin"/>
+      </w:r>
+      <w:r>
+        <w:instrText xml:space="preserve"> ADDIN ZOTERO_ITEM CSL_CITATION {"citationID":"6635feeb","properties":{"formattedCitation":"[9]","plainCitation":"[9]","noteIndex":0},"citationItems":[{"id":"EAW8456R","uris":["http://zotero.org/users/5591478/items/EAW8456R"],"itemData":{"id":"EAW8456R","type":"paper-conference","container-title":"2021 58th ACM/IEEE Design Automation Conference (DAC)","DOI":"10.1109/dac18074.2021.9586304","note":"Citation Key: Lumpp21","page":"685-690","publisher":"IEEE","title":"A Framework for Optimizing CPU-iGPU Communication on Embedded Platforms","URL":"https://doi.org/10.1109/dac18074.2021.9586304","author":[{"family":"Lumpp","given":"Francesco"},{"family":"Patel","given":"Hiren D."},{"family":"Bombieri","given":"Nicola"}],"issued":{"date-parts":[[2021,12]]}}}],"schema":"https://github.com/citation-style-language/schema/raw/master/csl-citation.json"} </w:instrText>
+      </w:r>
+      <w:r>
+        <w:fldChar w:fldCharType="separate"/>
+      </w:r>
+      <w:r>
+        <w:t xml:space="preserve">[9]</w:t>
+      </w:r>
+      <w:r>
+        <w:fldChar w:fldCharType="end"/>
+      </w:r>
+      <w:r>
+        <w:t xml:space="preserve"> as on early APUs </w:t>
+      </w:r>
+      <w:r>
+        <w:fldChar w:fldCharType="begin"/>
+      </w:r>
+      <w:r>
+        <w:instrText xml:space="preserve"> ADDIN ZOTERO_ITEM CSL_CITATION {"citationID":"316c0262","properties":{"formattedCitation":"[8]","plainCitation":"[8]","noteIndex":0},"citationItems":[{"id":"XFCXEPHQ","uris":["http://zotero.org/users/5591478/items/XFCXEPHQ"],"itemData":{"id":"XFCXEPHQ","type":"paper-conference","collection-title":"CF′12","container-title":"Proceedings of the 9th conference on Computing Frontiers","DOI":"10.1145/2212908.2212924","note":"Citation Key: Spafford12","page":"103-112","publisher":"ACM","title":"The tradeoffs of fused memory hierarchies in heterogeneous computing architectures","URL":"https://doi.org/10.1145/2212908.2212924","author":[{"family":"Spafford","given":"Kyle L."},{"family":"Meredith","given":"Jeremy S."},{"family":"Lee","given":"Seyong"},{"family":"Li","given":"Dong"},{"family":"Roth","given":"Philip C."},{"family":"Vetter","given":"Jeffrey S."}],"issued":{"date-parts":[[2012,5]]}}}],"schema":"https://github.com/citation-style-language/schema/raw/master/csl-citation.json"} </w:instrText>
+      </w:r>
+      <w:r>
+        <w:fldChar w:fldCharType="separate"/>
+      </w:r>
+      <w:r>
+        <w:t xml:space="preserve">[8]</w:t>
+      </w:r>
+      <w:r>
+        <w:fldChar w:fldCharType="end"/>
+      </w:r>
+      <w:r>
+        <w:t xml:space="preserve">. Our Sect. 6 crossover measures that dependence directly in payload size and GPU state, on one benchmark that runs unchanged on both platforms.</w:t>
       </w:r>
     </w:p>
     <w:p>
@@ -792,7 +936,43 @@
         <w:t xml:space="preserve">Collaboration benchmarks</w:t>
       </w:r>
       <w:r>
-        <w:t xml:space="preserve"> (GomezLuna17, Sun16) define the fine-grained CPU–GPU patterns, but they target integrated architectures through OpenCL, CUDA or C++ AMP. Neither compares a unified-memory SoC with a discrete GPU on one shader source with identical buffer layouts.</w:t>
+        <w:t xml:space="preserve"> </w:t>
+      </w:r>
+      <w:r>
+        <w:fldChar w:fldCharType="begin"/>
+      </w:r>
+      <w:r>
+        <w:instrText xml:space="preserve"> ADDIN ZOTERO_ITEM CSL_CITATION {"citationID":"5b126fa5","properties":{"formattedCitation":"[10, 11]","plainCitation":"[10, 11]","noteIndex":0},"citationItems":[{"id":"IXIHP6NZ","uris":["http://zotero.org/users/5591478/items/IXIHP6NZ"],"itemData":{"id":"IXIHP6NZ","type":"paper-conference","container-title":"2017 IEEE International Symposium on Performance Analysis of Systems and Software (ISPASS)","DOI":"10.1109/ispass.2017.7975269","note":"Citation Key: GomezLuna17","page":"43-54","publisher":"IEEE","title":"Chai: Collaborative heterogeneous applications for integrated-architectures","URL":"https://doi.org/10.1109/ispass.2017.7975269","author":[{"family":"Gómez-Luna","given":"Juan"},{"family":"El Hajj","given":"Izzat"},{"family":"Chang","given":"Li-Wen"},{"family":"García-Flores","given":"Victor"},{"family":"Garcia de Gonzalo","given":"Simon"},{"family":"Jablin","given":"Thomas B."},{"family":"Peña","given":"Antonio J."},{"family":"Hwu","given":"Wen-mei"}],"issued":{"date-parts":[[2017,4]]}}},{"id":"S8VS4KSE","uris":["http://zotero.org/users/5591478/items/S8VS4KSE"],"itemData":{"id":"S8VS4KSE","type":"paper-conference","container-title":"2016 IEEE International Symposium on Workload Characterization (IISWC)","DOI":"10.1109/iiswc.2016.7581262","note":"Citation Key: Sun16","page":"1-10","publisher":"IEEE","title":"Hetero-mark, a benchmark suite for CPU-GPU collaborative computing","URL":"https://doi.org/10.1109/iiswc.2016.7581262","author":[{"family":"Sun","given":"Yifan"},{"family":"Gong","given":"Xiang"},{"family":"Ziabari","given":"Amir Kavyan"},{"family":"Yu","given":"Leiming"},{"family":"Li","given":"Xiangyu"},{"family":"Mukherjee","given":"Saoni"},{"family":"McCardwell","given":"Carter"},{"family":"Villegas","given":"Alejandro"},{"family":"Kaeli","given":"David"}],"issued":{"date-parts":[[2016,9]]}}}],"schema":"https://github.com/citation-style-language/schema/raw/master/csl-citation.json"} </w:instrText>
+      </w:r>
+      <w:r>
+        <w:fldChar w:fldCharType="separate"/>
+      </w:r>
+      <w:r>
+        <w:t xml:space="preserve">[10, 11]</w:t>
+      </w:r>
+      <w:r>
+        <w:fldChar w:fldCharType="end"/>
+      </w:r>
+      <w:r>
+        <w:t xml:space="preserve"> define the fine-grained CPU–GPU patterns, but they target integrated architectures through OpenCL, CUDA or C++ AMP, and Gera et al. </w:t>
+      </w:r>
+      <w:r>
+        <w:fldChar w:fldCharType="begin"/>
+      </w:r>
+      <w:r>
+        <w:instrText xml:space="preserve"> ADDIN ZOTERO_ITEM CSL_CITATION {"citationID":"599729fe","properties":{"formattedCitation":"[12]","plainCitation":"[12]","noteIndex":0},"citationItems":[{"id":"SUVUGF4V","uris":["http://zotero.org/users/5591478/items/SUVUGF4V"],"itemData":{"id":"SUVUGF4V","type":"paper-conference","container-title":"2018 IEEE International Symposium on Performance Analysis of Systems and Software (ISPASS)","DOI":"10.1109/ispass.2018.00027","note":"Citation Key: Gera18","page":"139-148","publisher":"IEEE","title":"Performance Characterisation and Simulation of Intel’s Integrated GPU Architecture","URL":"https://doi.org/10.1109/ispass.2018.00027","author":[{"family":"Gera","given":"Prasun"},{"family":"Kim","given":"Hyojong"},{"family":"Kim","given":"Hyesoon"},{"family":"Hong","given":"Sunpyo"},{"family":"George","given":"Vinod"},{"family":"Luk","given":"Chi-Keung"}],"issued":{"date-parts":[[2018,4]]}}}],"schema":"https://github.com/citation-style-language/schema/raw/master/csl-citation.json"} </w:instrText>
+      </w:r>
+      <w:r>
+        <w:fldChar w:fldCharType="separate"/>
+      </w:r>
+      <w:r>
+        <w:t xml:space="preserve">[12]</w:t>
+      </w:r>
+      <w:r>
+        <w:fldChar w:fldCharType="end"/>
+      </w:r>
+      <w:r>
+        <w:t xml:space="preserve"> characterize Intel's integrated GPU with microbenchmarks that include CPU–GPU cache sharing. Neither compares a unified-memory SoC with a discrete GPU on one shader source with identical buffer layouts.</w:t>
       </w:r>
     </w:p>
     <w:p>
@@ -811,7 +991,25 @@
         <w:t xml:space="preserve">Apple Silicon studies</w:t>
       </w:r>
       <w:r>
-        <w:t xml:space="preserve"> (Feng25, Huebner25, Beischl26) look at ML training, HPC kernels and databases.</w:t>
+        <w:t xml:space="preserve"> </w:t>
+      </w:r>
+      <w:r>
+        <w:fldChar w:fldCharType="begin"/>
+      </w:r>
+      <w:r>
+        <w:instrText xml:space="preserve"> ADDIN ZOTERO_ITEM CSL_CITATION {"citationID":"bdd12aee","properties":{"formattedCitation":"[3, 4, 13]","plainCitation":"[3, 4, 13]","noteIndex":0},"citationItems":[{"id":"B5Q9E3C9","uris":["http://zotero.org/users/5591478/items/B5Q9E3C9"],"itemData":{"id":"B5Q9E3C9","type":"article","DOI":"10.48550/arXiv.2502.05317","note":"Citation Key: Huebner25","number":"arXiv:2502.05317","publisher":"arXiv","title":"Apple vs. Oranges: Evaluating the Apple Silicon M-Series SoCs for HPC Performance and Efficiency","URL":"https://arxiv.org/abs/2502.05317","author":[{"family":"Hübner","given":"Paul"},{"family":"Hu","given":"Andong"},{"family":"Peng","given":"Ivy"},{"family":"Markidis","given":"Stefano"}],"issued":{"date-parts":[[2025]]}}},{"id":"9RHUAUDT","uris":["http://zotero.org/users/5591478/items/9RHUAUDT"],"itemData":{"id":"9RHUAUDT","type":"paper-conference","collection-title":"DaMoN ’26","container-title":"Proceedings of the 22nd International Workshop on Data Management on New Hardware","DOI":"10.1145/3789237.3809127","note":"Citation Key: Beischl26","page":"1-10","publisher":"ACM","title":"Evaluating Apple Silicon for Data Processing","URL":"https://doi.org/10.1145/3789237.3809127","author":[{"family":"Beischl","given":"Alexander"},{"family":"Morozov","given":"Mykola"},{"family":"Jungmair","given":"Michael"},{"family":"Haussmann","given":"Lukas"},{"family":"Neumann","given":"Thomas"}],"issued":{"date-parts":[[2026,5]]}}},{"id":"MFGDN9HN","uris":["http://zotero.org/users/5591478/items/MFGDN9HN"],"itemData":{"id":"MFGDN9HN","type":"article","DOI":"10.48550/arXiv.2501.14925","note":"Citation Key: Feng25","number":"arXiv:2501.14925","publisher":"arXiv","title":"Profiling Apple Silicon Performance for ML Training","URL":"https://arxiv.org/abs/2501.14925","author":[{"family":"Feng","given":"Dahua"},{"family":"Xu","given":"Zhiming"},{"family":"Wang","given":"Rongxiang"},{"family":"Lin","given":"Felix Xiaozhu"}],"issued":{"date-parts":[[2025]]}}}],"schema":"https://github.com/citation-style-language/schema/raw/master/csl-citation.json"} </w:instrText>
+      </w:r>
+      <w:r>
+        <w:fldChar w:fldCharType="separate"/>
+      </w:r>
+      <w:r>
+        <w:t xml:space="preserve">[3, 4, 13]</w:t>
+      </w:r>
+      <w:r>
+        <w:fldChar w:fldCharType="end"/>
+      </w:r>
+      <w:r>
+        <w:t xml:space="preserve"> look at ML training, HPC kernels and databases.</w:t>
       </w:r>
     </w:p>
     <w:p>
@@ -823,7 +1021,25 @@
         </w:numPr>
       </w:pPr>
       <w:r>
-        <w:t xml:space="preserve">Feng25 already points to kernel launch time as a factor in the gap with NVIDIA.</w:t>
+        <w:t xml:space="preserve">Feng et al. </w:t>
+      </w:r>
+      <w:r>
+        <w:fldChar w:fldCharType="begin"/>
+      </w:r>
+      <w:r>
+        <w:instrText xml:space="preserve"> ADDIN ZOTERO_ITEM CSL_CITATION {"citationID":"0f0bdfed","properties":{"formattedCitation":"[13]","plainCitation":"[13]","noteIndex":0},"citationItems":[{"id":"MFGDN9HN","uris":["http://zotero.org/users/5591478/items/MFGDN9HN"],"itemData":{"id":"MFGDN9HN","type":"article","DOI":"10.48550/arXiv.2501.14925","note":"Citation Key: Feng25","number":"arXiv:2501.14925","publisher":"arXiv","title":"Profiling Apple Silicon Performance for ML Training","URL":"https://arxiv.org/abs/2501.14925","author":[{"family":"Feng","given":"Dahua"},{"family":"Xu","given":"Zhiming"},{"family":"Wang","given":"Rongxiang"},{"family":"Lin","given":"Felix Xiaozhu"}],"issued":{"date-parts":[[2025]]}}}],"schema":"https://github.com/citation-style-language/schema/raw/master/csl-citation.json"} </w:instrText>
+      </w:r>
+      <w:r>
+        <w:fldChar w:fldCharType="separate"/>
+      </w:r>
+      <w:r>
+        <w:t xml:space="preserve">[13]</w:t>
+      </w:r>
+      <w:r>
+        <w:fldChar w:fldCharType="end"/>
+      </w:r>
+      <w:r>
+        <w:t xml:space="preserve"> already point to kernel launch time as a factor in the gap with NVIDIA.</w:t>
       </w:r>
     </w:p>
     <w:p>
@@ -854,7 +1070,43 @@
         <w:t xml:space="preserve">Launch and dispatch overhead are known to be tens of µs, but measured one way.</w:t>
       </w:r>
       <w:r>
-        <w:t xml:space="preserve"> Maczan26 separates the marginal cost of a dispatch (24–36 µs Vulkan, 32–71 µs Metal) from the synchronization that a naive single-op timing folds in (450 of 497 µs). Cassagne25 reports host-to-kernel-start latency from ≈ 5 µs (RTX 4090) to 35–40 µs (Intel iGPUs). Both measure the CPU→GPU direction only. Our round trip is exactly the part they exclude: the full hand-off in both directions, repeated within a frame, which is what a game pays for each K.</w:t>
+        <w:t xml:space="preserve"> Maczan </w:t>
+      </w:r>
+      <w:r>
+        <w:fldChar w:fldCharType="begin"/>
+      </w:r>
+      <w:r>
+        <w:instrText xml:space="preserve"> ADDIN ZOTERO_ITEM CSL_CITATION {"citationID":"b34883b6","properties":{"formattedCitation":"[14]","plainCitation":"[14]","noteIndex":0},"citationItems":[{"id":"Q7E37WC4","uris":["http://zotero.org/users/5591478/items/Q7E37WC4"],"itemData":{"id":"Q7E37WC4","type":"article","DOI":"10.48550/arXiv.2608.08730","note":"Citation Key: Maczan26","number":"arXiv:2608.08730","publisher":"arXiv","title":"Measuring and Reducing WebGPU Dispatch Overhead for LLM Inference","URL":"https://arxiv.org/abs/2608.08730","author":[{"family":"Maczan","given":"Jędrzej"}],"issued":{"date-parts":[[2026]]}}}],"schema":"https://github.com/citation-style-language/schema/raw/master/csl-citation.json"} </w:instrText>
+      </w:r>
+      <w:r>
+        <w:fldChar w:fldCharType="separate"/>
+      </w:r>
+      <w:r>
+        <w:t xml:space="preserve">[14]</w:t>
+      </w:r>
+      <w:r>
+        <w:fldChar w:fldCharType="end"/>
+      </w:r>
+      <w:r>
+        <w:t xml:space="preserve"> separates the marginal cost of a dispatch (24–36 µs Vulkan, 32–71 µs Metal) from the synchronization that a naive single-op timing folds in (450 of 497 µs). Cassagne et al. </w:t>
+      </w:r>
+      <w:r>
+        <w:fldChar w:fldCharType="begin"/>
+      </w:r>
+      <w:r>
+        <w:instrText xml:space="preserve"> ADDIN ZOTERO_ITEM CSL_CITATION {"citationID":"dba1fdf3","properties":{"formattedCitation":"[15]","plainCitation":"[15]","noteIndex":0},"citationItems":[{"id":"TE2TJ63A","uris":["http://zotero.org/users/5591478/items/TE2TJ63A"],"itemData":{"id":"TE2TJ63A","type":"article","DOI":"10.48550/arXiv.2508.10481","note":"Citation Key: Cassagne25","number":"arXiv:2508.10481","publisher":"arXiv","title":"Dalek: An Unconventional and Energy-Aware Heterogeneous Cluster","URL":"https://arxiv.org/abs/2508.10481","author":[{"family":"Cassagne","given":"Adrien"},{"family":"Amiot","given":"Noé"},{"family":"Bouyer","given":"Manuel"}],"issued":{"date-parts":[[2025]]}}}],"schema":"https://github.com/citation-style-language/schema/raw/master/csl-citation.json"} </w:instrText>
+      </w:r>
+      <w:r>
+        <w:fldChar w:fldCharType="separate"/>
+      </w:r>
+      <w:r>
+        <w:t xml:space="preserve">[15]</w:t>
+      </w:r>
+      <w:r>
+        <w:fldChar w:fldCharType="end"/>
+      </w:r>
+      <w:r>
+        <w:t xml:space="preserve"> report host-to-kernel-start latency from ≈ 5 µs (RTX 4090) to 35–40 µs (Intel iGPUs). Both measure the CPU→GPU direction only. Our round trip is exactly the part they exclude: the full hand-off in both directions, repeated within a frame, which is what a game pays for each K.</w:t>
       </w:r>
     </w:p>
     <w:p>
@@ -873,7 +1125,25 @@
         <w:t xml:space="preserve">GPU power-state transitions are slow and vendor-specific.</w:t>
       </w:r>
       <w:r>
-        <w:t xml:space="preserve"> Velicka25 measures DVFS switching latency on data-centre NVIDIA GPUs. We found no study of idle-state exit latency, on Apple or NVIDIA. So Sect. 5/Sect. 6 can only say the multimodal M5 hand-off is "consistent with" a power-state effect, and the hot-GPU cells test that reading directly.</w:t>
+        <w:t xml:space="preserve"> Velicka et al. </w:t>
+      </w:r>
+      <w:r>
+        <w:fldChar w:fldCharType="begin"/>
+      </w:r>
+      <w:r>
+        <w:instrText xml:space="preserve"> ADDIN ZOTERO_ITEM CSL_CITATION {"citationID":"2dc5e099","properties":{"formattedCitation":"[16, 17]","plainCitation":"[16, 17]","noteIndex":0},"citationItems":[{"id":"JH7NE5WJ","uris":["http://zotero.org/users/5591478/items/JH7NE5WJ"],"itemData":{"id":"JH7NE5WJ","type":"paper-conference","container-title":"2025 IEEE International Parallel and Distributed Processing Symposium Workshops (IPDPSW)","DOI":"10.1109/ipdpsw66978.2025.00133","note":"Citation Key: Velicka25","page":"830-839","publisher":"IEEE","title":"Methodology for GPU Frequency Switching Latency Measurement","URL":"https://doi.org/10.1109/ipdpsw66978.2025.00133","author":[{"family":"Velicka","given":"Daniel"},{"family":"Vysocky","given":"Ondrej"},{"family":"Riha","given":"Lubomir"}],"issued":{"date-parts":[[2025,6]]}}},{"id":"63M2D7IM","uris":["http://zotero.org/users/5591478/items/63M2D7IM"],"itemData":{"id":"63M2D7IM","type":"article-journal","container-title":"Future Generation Computer Systems","DOI":"10.1016/j.future.2025.108331","ISSN":"0167-739X","note":"Citation Key: Velicka26","page":"108331","title":"An in-depth study of GPU frequency-scaling latency and its optimization on modern architectures","URL":"https://doi.org/10.1016/j.future.2025.108331","volume":"179","author":[{"family":"Velicka","given":"Daniel"},{"family":"Vysocky","given":"Ondrej"},{"family":"Yasal","given":"Osman"},{"family":"Riha","given":"Lubomir"}],"issued":{"date-parts":[[2026,6]]}}}],"schema":"https://github.com/citation-style-language/schema/raw/master/csl-citation.json"} </w:instrText>
+      </w:r>
+      <w:r>
+        <w:fldChar w:fldCharType="separate"/>
+      </w:r>
+      <w:r>
+        <w:t xml:space="preserve">[16, 17]</w:t>
+      </w:r>
+      <w:r>
+        <w:fldChar w:fldCharType="end"/>
+      </w:r>
+      <w:r>
+        <w:t xml:space="preserve"> measure DVFS switching latency on data-centre NVIDIA GPUs and find that it differs widely between GPUs. We found no study of idle-state exit latency, on Apple or NVIDIA. So Sects. 5 and 6 can only say the multimodal M5 hand-off is "consistent with" a power-state effect, and the hot-GPU cells test that reading directly.</w:t>
       </w:r>
     </w:p>
     <w:p>
@@ -892,7 +1162,25 @@
         <w:t xml:space="preserve">Workload side.</w:t>
       </w:r>
       <w:r>
-        <w:t xml:space="preserve"> Hybrid CPU+GPU crowd simulation exists as an HPC problem (Skrzypczak23: load balancing over 10k–1M agents, throughput-oriented). Real-time swarms with CPU-side decisions inside a 16.7 ms frame are not studied there.</w:t>
+        <w:t xml:space="preserve"> Hybrid CPU+GPU crowd simulation exists as an HPC problem </w:t>
+      </w:r>
+      <w:r>
+        <w:fldChar w:fldCharType="begin"/>
+      </w:r>
+      <w:r>
+        <w:instrText xml:space="preserve"> ADDIN ZOTERO_ITEM CSL_CITATION {"citationID":"04c680c3","properties":{"formattedCitation":"[18]","plainCitation":"[18]","noteIndex":0},"citationItems":[{"id":"HHZZZEFU","uris":["http://zotero.org/users/5591478/items/HHZZZEFU"],"itemData":{"id":"HHZZZEFU","type":"article-journal","container-title":"Simulation Modelling Practice and Theory","DOI":"10.1016/j.simpat.2022.102691","ISSN":"1569-190X","note":"Citation Key: Skrzypczak23","page":"102691","title":"Efficient parallel implementation of crowd simulation using a hybrid CPU+GPU high performance computing system","URL":"https://doi.org/10.1016/j.simpat.2022.102691","volume":"123","author":[{"family":"Skrzypczak","given":"Jakub"},{"family":"Czarnul","given":"Paweł"}],"issued":{"date-parts":[[2023,2]]}}}],"schema":"https://github.com/citation-style-language/schema/raw/master/csl-citation.json"} </w:instrText>
+      </w:r>
+      <w:r>
+        <w:fldChar w:fldCharType="separate"/>
+      </w:r>
+      <w:r>
+        <w:t xml:space="preserve">[18]</w:t>
+      </w:r>
+      <w:r>
+        <w:fldChar w:fldCharType="end"/>
+      </w:r>
+      <w:r>
+        <w:t xml:space="preserve">: load balancing over 10k–1M agents, throughput-oriented. Real-time swarms with CPU-side decisions inside a 16.7 ms frame are not studied there.</w:t>
       </w:r>
     </w:p>
     <w:p>
@@ -904,10 +1192,10 @@
           <w:b/>
           <w:bCs/>
         </w:rPr>
-        <w:t xml:space="preserve">Gap (to state carefully, "we are not aware of"):</w:t>
-      </w:r>
-      <w:r>
-        <w:t xml:space="preserve"> this search found no peer-reviewed measurement of fine-grained, multiple-per-frame CPU–GPU round trips that compares a unified-memory SoC with PCIe GPUs on identical algorithms, ties the result to a game workload, or studies ReBAR's effect on the CPU→GPU write path. ReBAR coverage found so far is consumer game benchmarks only (TechPowerUp, Guru3D, PCGH), which is not citable as evidence.</w:t>
+        <w:t xml:space="preserve">Gap.</w:t>
+      </w:r>
+      <w:r>
+        <w:t xml:space="preserve"> We are not aware of a peer-reviewed measurement of fine-grained, multiple-per-step CPU–GPU round trips that compares a shared-memory SoC with PCIe GPUs on identical algorithms, ties the result to a real-time agent workload, or studies ReBAR's effect on the CPU→GPU write path. The ReBAR measurements we found are consumer game benchmarks, not controlled latency studies.</w:t>
       </w:r>
     </w:p>
     <w:p>
@@ -917,6 +1205,22 @@
       </w:pPr>
       <w:r>
         <w:t xml:space="preserve">3 Platforms</w:t>
+      </w:r>
+    </w:p>
+    <w:p>
+      <w:pPr>
+        <w:pStyle w:val="Caption"/>
+        <w:keepNext/>
+      </w:pPr>
+      <w:r>
+        <w:rPr>
+          <w:b/>
+          <w:bCs/>
+        </w:rPr>
+        <w:t xml:space="preserve">Table 1 </w:t>
+      </w:r>
+      <w:r>
+        <w:t xml:space="preserve">The two platforms</w:t>
       </w:r>
     </w:p>
     <w:tbl>
@@ -1690,7 +1994,23 @@
         <w:pStyle w:val="Normal"/>
       </w:pPr>
       <w:r>
-        <w:t xml:space="preserve">Both backends implement the same thin interface: timeline objects with GPU signal and wait, CPU signal and wait, memory classes, GPU timestamps and clock calibration. Kernels come from a single Slang source, compiled to MSL and SPIR-V, with identical thread-group sizes and buffer layouts checked by a unit test (R1).</w:t>
+        <w:t xml:space="preserve">Both backends implement the same thin interface: timeline objects with GPU signal and wait, CPU signal and wait, memory classes, GPU timestamps and clock calibration. Kernels come from a single Slang source, compiled to MSL and SPIR-V, with identical thread-group sizes and buffer layouts checked by a unit test (R1). Table 2 maps the interface to the two APIs.</w:t>
+      </w:r>
+    </w:p>
+    <w:p>
+      <w:pPr>
+        <w:pStyle w:val="Caption"/>
+        <w:keepNext/>
+      </w:pPr>
+      <w:r>
+        <w:rPr>
+          <w:b/>
+          <w:bCs/>
+        </w:rPr>
+        <w:t xml:space="preserve">Table 2 </w:t>
+      </w:r>
+      <w:r>
+        <w:t xml:space="preserve">The synchronization interface on the two APIs</w:t>
       </w:r>
     </w:p>
     <w:tbl>
@@ -2098,6 +2418,30 @@
       </w:pPr>
       <w:r>
         <w:t xml:space="preserve">4.3 Memory paths</w:t>
+      </w:r>
+    </w:p>
+    <w:p>
+      <w:pPr>
+        <w:pStyle w:val="Normal"/>
+      </w:pPr>
+      <w:r>
+        <w:t xml:space="preserve">Table 3 lists the memory paths.</w:t>
+      </w:r>
+    </w:p>
+    <w:p>
+      <w:pPr>
+        <w:pStyle w:val="Caption"/>
+        <w:keepNext/>
+      </w:pPr>
+      <w:r>
+        <w:rPr>
+          <w:b/>
+          <w:bCs/>
+        </w:rPr>
+        <w:t xml:space="preserve">Table 3 </w:t>
+      </w:r>
+      <w:r>
+        <w:t xml:space="preserve">Memory paths, per direction</w:t>
       </w:r>
     </w:p>
     <w:tbl>
@@ -2968,34 +3312,7 @@
         <w:t xml:space="preserve">Fig. 1 </w:t>
       </w:r>
       <w:r>
-        <w:t xml:space="preserve">CPU↔GPU round trip against payload per direction, GPU otherwise idle, chain submission, spin wait; line = p50 pooled over three runs, band up to p99. (a) direct path, (b) copy path. The grey column in each panel spans where the M5's curve crosses the 3060 Ti's, interpolated in log–log between neighbouring grid points (min–max over the nine pairs of runs and both ReBAR settings); nothing was measured inside it. Regenerate with </w:t>
-      </w:r>
-      <w:r>
-        <w:rPr>
-          <w:rStyle w:val="CodeChar"/>
-        </w:rPr>
-        <w:t xml:space="preserve">python3 tools/analysis/paper_fig1.py</w:t>
-      </w:r>
-      <w:r>
-        <w:t xml:space="preserve"> (reads </w:t>
-      </w:r>
-      <w:r>
-        <w:rPr>
-          <w:rStyle w:val="CodeChar"/>
-        </w:rPr>
-        <w:t xml:space="preserve">results/m1_report*/summary.csv</w:t>
-      </w:r>
-      <w:r>
-        <w:t xml:space="preserve"> and </w:t>
-      </w:r>
-      <w:r>
-        <w:rPr>
-          <w:rStyle w:val="CodeChar"/>
-        </w:rPr>
-        <w:t xml:space="preserve">results/m1_crossover/crossover.csv</w:t>
-      </w:r>
-      <w:r>
-        <w:t xml:space="preserve">).</w:t>
+        <w:t xml:space="preserve">CPU↔GPU round trip against payload per direction, GPU otherwise idle, chain submission, spin wait; line = p50 pooled over three runs, band up to p99. (a) direct path, (b) copy path. The grey column in each panel spans where the M5's curve crosses the 3060 Ti's, interpolated in log–log between neighbouring grid points (min–max over the nine pairs of runs and both ReBAR settings); nothing was measured inside it.</w:t>
       </w:r>
     </w:p>
     <w:p>
@@ -3010,7 +3327,23 @@
         <w:t xml:space="preserve">The criterion, fixed in advance:</w:t>
       </w:r>
       <w:r>
-        <w:t xml:space="preserve"> the M5's empty and 1 MiB round-trip p50 must be lower than both RTX cards' best Vulkan path by more than run-to-run noise. It fails on both cells, with and without ReBAR.</w:t>
+        <w:t xml:space="preserve"> the M5's empty and 1 MiB round-trip p50 must be lower than both RTX cards' best Vulkan path by more than run-to-run noise. It fails on both cells, with and without ReBAR (Table 4).</w:t>
+      </w:r>
+    </w:p>
+    <w:p>
+      <w:pPr>
+        <w:pStyle w:val="Caption"/>
+        <w:keepNext/>
+      </w:pPr>
+      <w:r>
+        <w:rPr>
+          <w:b/>
+          <w:bCs/>
+        </w:rPr>
+        <w:t xml:space="preserve">Table 4 </w:t>
+      </w:r>
+      <w:r>
+        <w:t xml:space="preserve">Round trip p50 / p99 in µs with the GPU idle (chain submission, spin wait, three runs pooled), and raw copy bandwidth</w:t>
       </w:r>
     </w:p>
     <w:tbl>
@@ -3853,7 +4186,23 @@
         <w:pStyle w:val="Normal"/>
       </w:pPr>
       <w:r>
-        <w:t xml:space="preserve">Per simulation tick (60 Hz fixed step; in bench mode one tick per rendered frame, vsync off):</w:t>
+        <w:t xml:space="preserve">Per simulation tick (60 Hz fixed step; in bench mode one tick per rendered frame, vsync off), the passes are those of Table 5.</w:t>
+      </w:r>
+    </w:p>
+    <w:p>
+      <w:pPr>
+        <w:pStyle w:val="Caption"/>
+        <w:keepNext/>
+      </w:pPr>
+      <w:r>
+        <w:rPr>
+          <w:b/>
+          <w:bCs/>
+        </w:rPr>
+        <w:t xml:space="preserve">Table 5 </w:t>
+      </w:r>
+      <w:r>
+        <w:t xml:space="preserve">The passes of one simulation step</w:t>
       </w:r>
     </w:p>
     <w:tbl>
@@ -4322,7 +4671,23 @@
         <w:t xml:space="preserve">Intent*</w:t>
       </w:r>
       <w:r>
-        <w:t xml:space="preserve">, and never knows how they were supplied (invariant R2). The orchestrator implements four strategies:</w:t>
+        <w:t xml:space="preserve">, and never knows how they were supplied (invariant R2). The orchestrator implements four strategies (Table 6).</w:t>
+      </w:r>
+    </w:p>
+    <w:p>
+      <w:pPr>
+        <w:pStyle w:val="Caption"/>
+        <w:keepNext/>
+      </w:pPr>
+      <w:r>
+        <w:rPr>
+          <w:b/>
+          <w:bCs/>
+        </w:rPr>
+        <w:t xml:space="preserve">Table 6 </w:t>
+      </w:r>
+      <w:r>
+        <w:t xml:space="preserve">Transfer strategies</w:t>
       </w:r>
     </w:p>
     <w:tbl>
@@ -5092,7 +5457,23 @@
         <w:pStyle w:val="Normal"/>
       </w:pPr>
       <w:r>
-        <w:t xml:space="preserve">From the buffer layouts (docs/05 Sect. 5), one round trip moves:</w:t>
+        <w:t xml:space="preserve">From the buffer layouts, one round trip moves the bytes of Table 7.</w:t>
+      </w:r>
+    </w:p>
+    <w:p>
+      <w:pPr>
+        <w:pStyle w:val="Caption"/>
+        <w:keepNext/>
+      </w:pPr>
+      <w:r>
+        <w:rPr>
+          <w:b/>
+          <w:bCs/>
+        </w:rPr>
+        <w:t xml:space="preserve">Table 7 </w:t>
+      </w:r>
+      <w:r>
+        <w:t xml:space="preserve">Bytes per round trip</w:t>
       </w:r>
     </w:p>
     <w:tbl>
@@ -5896,7 +6277,7 @@
         <w:pStyle w:val="ListParagraph"/>
         <w:numPr>
           <w:ilvl w:val="0"/>
-          <w:numId w:val="6"/>
+          <w:numId w:val="5"/>
         </w:numPr>
       </w:pPr>
       <w:r>
@@ -5924,7 +6305,7 @@
         <w:pStyle w:val="ListParagraph"/>
         <w:numPr>
           <w:ilvl w:val="0"/>
-          <w:numId w:val="6"/>
+          <w:numId w:val="5"/>
         </w:numPr>
       </w:pPr>
       <w:r>
@@ -5943,7 +6324,7 @@
         <w:pStyle w:val="ListParagraph"/>
         <w:numPr>
           <w:ilvl w:val="0"/>
-          <w:numId w:val="6"/>
+          <w:numId w:val="5"/>
         </w:numPr>
       </w:pPr>
       <w:r>
@@ -5999,7 +6380,7 @@
         <w:pStyle w:val="ListParagraph"/>
         <w:numPr>
           <w:ilvl w:val="0"/>
-          <w:numId w:val="7"/>
+          <w:numId w:val="5"/>
         </w:numPr>
       </w:pPr>
       <w:r>
@@ -6448,6 +6829,160 @@
       </w:r>
       <w:r>
         <w:t xml:space="preserve">Yu Q, Childers B, Huang L, et al (2020) A quantitative evaluation of unified memory in GPUs. The Journal of Supercomputing 76:2958–2985. https://doi.org/10.1007/s11227-019-03079-y</w:t>
+      </w:r>
+    </w:p>
+    <w:p>
+      <w:pPr>
+        <w:pStyle w:val="Bibliography"/>
+      </w:pPr>
+      <w:r>
+        <w:t xml:space="preserve">8.</w:t>
+      </w:r>
+      <w:r>
+        <w:tab/>
+      </w:r>
+      <w:r>
+        <w:t xml:space="preserve">Spafford KL, Meredith JS, Lee S, et al (2012) The tradeoffs of fused memory hierarchies in heterogeneous computing architectures. In: Proceedings of the 9th conference on Computing Frontiers. ACM, pp 103–112</w:t>
+      </w:r>
+    </w:p>
+    <w:p>
+      <w:pPr>
+        <w:pStyle w:val="Bibliography"/>
+      </w:pPr>
+      <w:r>
+        <w:t xml:space="preserve">9.</w:t>
+      </w:r>
+      <w:r>
+        <w:tab/>
+      </w:r>
+      <w:r>
+        <w:t xml:space="preserve">Lumpp F, Patel HD, Bombieri N (2021) A Framework for Optimizing CPU-iGPU Communication on Embedded Platforms. In: 2021 58th ACM/IEEE Design Automation Conference (DAC). IEEE, pp 685–690</w:t>
+      </w:r>
+    </w:p>
+    <w:p>
+      <w:pPr>
+        <w:pStyle w:val="Bibliography"/>
+      </w:pPr>
+      <w:r>
+        <w:t xml:space="preserve">10.</w:t>
+      </w:r>
+      <w:r>
+        <w:tab/>
+      </w:r>
+      <w:r>
+        <w:t xml:space="preserve">Gómez-Luna J, El Hajj I, Chang L-W, et al (2017) Chai: Collaborative heterogeneous applications for integrated-architectures. In: 2017 IEEE International Symposium on Performance Analysis of Systems and Software (ISPASS). IEEE, pp 43–54</w:t>
+      </w:r>
+    </w:p>
+    <w:p>
+      <w:pPr>
+        <w:pStyle w:val="Bibliography"/>
+      </w:pPr>
+      <w:r>
+        <w:t xml:space="preserve">11.</w:t>
+      </w:r>
+      <w:r>
+        <w:tab/>
+      </w:r>
+      <w:r>
+        <w:t xml:space="preserve">Sun Y, Gong X, Ziabari AK, et al (2016) Hetero-mark, a benchmark suite for CPU-GPU collaborative computing. In: 2016 IEEE International Symposium on Workload Characterization (IISWC). IEEE, pp 1–10</w:t>
+      </w:r>
+    </w:p>
+    <w:p>
+      <w:pPr>
+        <w:pStyle w:val="Bibliography"/>
+      </w:pPr>
+      <w:r>
+        <w:t xml:space="preserve">12.</w:t>
+      </w:r>
+      <w:r>
+        <w:tab/>
+      </w:r>
+      <w:r>
+        <w:t xml:space="preserve">Gera P, Kim H, Kim H, et al (2018) Performance Characterisation and Simulation of Intel’s Integrated GPU Architecture. In: 2018 IEEE International Symposium on Performance Analysis of Systems and Software (ISPASS). IEEE, pp 139–148</w:t>
+      </w:r>
+    </w:p>
+    <w:p>
+      <w:pPr>
+        <w:pStyle w:val="Bibliography"/>
+      </w:pPr>
+      <w:r>
+        <w:t xml:space="preserve">13.</w:t>
+      </w:r>
+      <w:r>
+        <w:tab/>
+      </w:r>
+      <w:r>
+        <w:t xml:space="preserve">Feng D, Xu Z, Wang R, Lin FX (2025) Profiling Apple Silicon Performance for ML Training</w:t>
+      </w:r>
+    </w:p>
+    <w:p>
+      <w:pPr>
+        <w:pStyle w:val="Bibliography"/>
+      </w:pPr>
+      <w:r>
+        <w:t xml:space="preserve">14.</w:t>
+      </w:r>
+      <w:r>
+        <w:tab/>
+      </w:r>
+      <w:r>
+        <w:t xml:space="preserve">Maczan J (2026) Measuring and Reducing WebGPU Dispatch Overhead for LLM Inference</w:t>
+      </w:r>
+    </w:p>
+    <w:p>
+      <w:pPr>
+        <w:pStyle w:val="Bibliography"/>
+      </w:pPr>
+      <w:r>
+        <w:t xml:space="preserve">15.</w:t>
+      </w:r>
+      <w:r>
+        <w:tab/>
+      </w:r>
+      <w:r>
+        <w:t xml:space="preserve">Cassagne A, Amiot N, Bouyer M (2025) Dalek: An Unconventional and Energy-Aware Heterogeneous Cluster</w:t>
+      </w:r>
+    </w:p>
+    <w:p>
+      <w:pPr>
+        <w:pStyle w:val="Bibliography"/>
+      </w:pPr>
+      <w:r>
+        <w:t xml:space="preserve">16.</w:t>
+      </w:r>
+      <w:r>
+        <w:tab/>
+      </w:r>
+      <w:r>
+        <w:t xml:space="preserve">Velicka D, Vysocky O, Riha L (2025) Methodology for GPU Frequency Switching Latency Measurement. In: 2025 IEEE International Parallel and Distributed Processing Symposium Workshops (IPDPSW). IEEE, pp 830–839</w:t>
+      </w:r>
+    </w:p>
+    <w:p>
+      <w:pPr>
+        <w:pStyle w:val="Bibliography"/>
+      </w:pPr>
+      <w:r>
+        <w:t xml:space="preserve">17.</w:t>
+      </w:r>
+      <w:r>
+        <w:tab/>
+      </w:r>
+      <w:r>
+        <w:t xml:space="preserve">Velicka D, Vysocky O, Yasal O, Riha L (2026) An in-depth study of GPU frequency-scaling latency and its optimization on modern architectures. Future Generation Computer Systems 179:108331. https://doi.org/10.1016/j.future.2025.108331</w:t>
+      </w:r>
+    </w:p>
+    <w:p>
+      <w:pPr>
+        <w:pStyle w:val="Bibliography"/>
+      </w:pPr>
+      <w:r>
+        <w:t xml:space="preserve">18.</w:t>
+      </w:r>
+      <w:r>
+        <w:tab/>
+      </w:r>
+      <w:r>
+        <w:t xml:space="preserve">Skrzypczak J, Czarnul P (2023) Efficient parallel implementation of crowd simulation using a hybrid CPU+GPU high performance computing system. Simulation Modelling Practice and Theory 123:102691. https://doi.org/10.1016/j.simpat.2022.102691</w:t>
       </w:r>
       <w:r>
         <w:fldChar w:fldCharType="end"/>
@@ -6554,18 +7089,6 @@
     </w:lvlOverride>
   </w:num>
   <w:num w:numId="5">
-    <w:abstractNumId w:val="1"/>
-    <w:lvlOverride w:ilvl="0">
-      <w:startOverride w:val="1"/>
-    </w:lvlOverride>
-  </w:num>
-  <w:num w:numId="6">
-    <w:abstractNumId w:val="1"/>
-    <w:lvlOverride w:ilvl="0">
-      <w:startOverride w:val="1"/>
-    </w:lvlOverride>
-  </w:num>
-  <w:num w:numId="7">
     <w:abstractNumId w:val="1"/>
     <w:lvlOverride w:ilvl="0">
       <w:startOverride w:val="1"/>

</xml_diff>

<commit_message>
paper: build_docx.py — schema order inside pPr/rPr, docPropsVTypes namespace for the Zotero prefs
Co-Authored-By: Claude Fable 5.1 <noreply@anthropic.com>
</commit_message>
<xml_diff>
--- a/docs/paper/lightbound_jsc.docx
+++ b/docs/paper/lightbound_jsc.docx
@@ -7132,14 +7132,14 @@
     <w:next w:val="Normal"/>
     <w:qFormat/>
     <w:pPr>
+      <w:keepNext/>
       <w:spacing w:before="0" w:after="240" w:line="240" w:lineRule="auto"/>
-      <w:keepNext/>
     </w:pPr>
     <w:rPr>
+      <w:b/>
+      <w:bCs/>
       <w:sz w:val="32"/>
       <w:szCs w:val="32"/>
-      <w:b/>
-      <w:bCs/>
     </w:rPr>
   </w:style>
   <w:style w:type="paragraph" w:styleId="Author">
@@ -7164,10 +7164,10 @@
       <w:spacing w:before="0" w:after="60" w:line="240" w:lineRule="auto"/>
     </w:pPr>
     <w:rPr>
+      <w:i/>
+      <w:iCs/>
       <w:sz w:val="20"/>
       <w:szCs w:val="20"/>
-      <w:i/>
-      <w:iCs/>
     </w:rPr>
   </w:style>
   <w:style w:type="paragraph" w:styleId="Abstract">
@@ -7204,16 +7204,16 @@
     <w:next w:val="Normal"/>
     <w:qFormat/>
     <w:pPr>
-      <w:spacing w:before="360" w:after="120" w:line="240" w:lineRule="auto"/>
       <w:keepNext/>
       <w:keepLines/>
+      <w:spacing w:before="360" w:after="120" w:line="240" w:lineRule="auto"/>
       <w:outlineLvl w:val="0"/>
     </w:pPr>
     <w:rPr>
+      <w:b/>
+      <w:bCs/>
       <w:sz w:val="26"/>
       <w:szCs w:val="26"/>
-      <w:b/>
-      <w:bCs/>
     </w:rPr>
   </w:style>
   <w:style w:type="paragraph" w:styleId="Heading2">
@@ -7222,16 +7222,16 @@
     <w:next w:val="Normal"/>
     <w:qFormat/>
     <w:pPr>
-      <w:spacing w:before="240" w:after="120" w:line="240" w:lineRule="auto"/>
       <w:keepNext/>
       <w:keepLines/>
+      <w:spacing w:before="240" w:after="120" w:line="240" w:lineRule="auto"/>
       <w:outlineLvl w:val="1"/>
     </w:pPr>
     <w:rPr>
+      <w:b/>
+      <w:bCs/>
       <w:sz w:val="23"/>
       <w:szCs w:val="23"/>
-      <w:b/>
-      <w:bCs/>
     </w:rPr>
   </w:style>
   <w:style w:type="paragraph" w:styleId="Heading3">
@@ -7240,18 +7240,18 @@
     <w:next w:val="Normal"/>
     <w:qFormat/>
     <w:pPr>
-      <w:spacing w:before="200" w:after="80" w:line="240" w:lineRule="auto"/>
       <w:keepNext/>
       <w:keepLines/>
+      <w:spacing w:before="200" w:after="80" w:line="240" w:lineRule="auto"/>
       <w:outlineLvl w:val="2"/>
     </w:pPr>
     <w:rPr>
-      <w:sz w:val="22"/>
-      <w:szCs w:val="22"/>
       <w:b/>
       <w:bCs/>
       <w:i/>
       <w:iCs/>
+      <w:sz w:val="22"/>
+      <w:szCs w:val="22"/>
     </w:rPr>
   </w:style>
   <w:style w:type="paragraph" w:styleId="ListParagraph">
@@ -7270,8 +7270,8 @@
     <w:next w:val="Normal"/>
     <w:qFormat/>
     <w:pPr>
+      <w:keepNext/>
       <w:spacing w:before="120" w:after="60" w:line="240" w:lineRule="auto"/>
-      <w:keepNext/>
     </w:pPr>
     <w:rPr>
       <w:sz w:val="20"/>
@@ -7297,8 +7297,8 @@
     <w:next w:val="Normal"/>
     <w:qFormat/>
     <w:pPr>
+      <w:keepNext/>
       <w:spacing w:before="120" w:after="0" w:line="240" w:lineRule="auto"/>
-      <w:keepNext/>
       <w:jc w:val="center"/>
     </w:pPr>
   </w:style>

</xml_diff>

<commit_message>
paper: build_docx.py — numbering tab stop at the hanging indent
Co-Authored-By: Claude Fable 5.1 <noreply@anthropic.com>
</commit_message>
<xml_diff>
--- a/docs/paper/lightbound_jsc.docx
+++ b/docs/paper/lightbound_jsc.docx
@@ -7033,6 +7033,9 @@
       <w:lvlText w:val="•"/>
       <w:lvlJc w:val="left"/>
       <w:pPr>
+        <w:tabs>
+          <w:tab w:val="num" w:pos="720"/>
+        </w:tabs>
         <w:ind w:left="720" w:hanging="360"/>
       </w:pPr>
     </w:lvl>
@@ -7042,6 +7045,9 @@
       <w:lvlText w:val="–"/>
       <w:lvlJc w:val="left"/>
       <w:pPr>
+        <w:tabs>
+          <w:tab w:val="num" w:pos="1440"/>
+        </w:tabs>
         <w:ind w:left="1440" w:hanging="360"/>
       </w:pPr>
     </w:lvl>
@@ -7054,6 +7060,9 @@
       <w:lvlText w:val="%1."/>
       <w:lvlJc w:val="left"/>
       <w:pPr>
+        <w:tabs>
+          <w:tab w:val="num" w:pos="720"/>
+        </w:tabs>
         <w:ind w:left="720" w:hanging="360"/>
       </w:pPr>
     </w:lvl>
@@ -7063,6 +7072,9 @@
       <w:lvlText w:val="–"/>
       <w:lvlJc w:val="left"/>
       <w:pPr>
+        <w:tabs>
+          <w:tab w:val="num" w:pos="1440"/>
+        </w:tabs>
         <w:ind w:left="1440" w:hanging="360"/>
       </w:pPr>
     </w:lvl>

</xml_diff>

<commit_message>
paper: §6 draft (H1′ as pre-registered, predictions, measurement; results placeholder), in the Word build
Co-Authored-By: Claude Fable 5.1 <noreply@anthropic.com>
</commit_message>
<xml_diff>
--- a/docs/paper/lightbound_jsc.docx
+++ b/docs/paper/lightbound_jsc.docx
@@ -4047,14 +4047,157 @@
     </w:p>
     <w:p>
       <w:pPr>
+        <w:pStyle w:val="Heading2"/>
+        <w:keepNext/>
+      </w:pPr>
+      <w:r>
+        <w:t xml:space="preserve">6.1 The hypothesis, as written before the measurement</w:t>
+      </w:r>
+    </w:p>
+    <w:p>
+      <w:pPr>
         <w:pStyle w:val="Normal"/>
       </w:pPr>
       <w:r>
-        <w:rPr>
-          <w:i/>
-          <w:iCs/>
-        </w:rPr>
-        <w:t xml:space="preserve">[Written after the extension series on both platforms (H1′, predictions of 2026-10-13 in the protocol).]</w:t>
+        <w:t xml:space="preserve">H1′ was formulated on 2026-10-13, after the idle-GPU results of Sect. 5 were known and before any of the cells that test it were measured, and adopted on 2026-10-16 when H1 was given up. It reads: on shared physical memory the cost of a round trip is nearly flat in payload up to ≈ 1 MiB per direction and grows slowly beyond; over PCIe it grows linearly from ≈ 256 KiB. The two curves cross, and the crossover moves to smaller payloads when the GPU is busy. Its predictions, fixed at the same time, are:</w:t>
+      </w:r>
+    </w:p>
+    <w:p>
+      <w:pPr>
+        <w:pStyle w:val="ListParagraph"/>
+        <w:numPr>
+          <w:ilvl w:val="0"/>
+          <w:numId w:val="4"/>
+        </w:numPr>
+      </w:pPr>
+      <w:r>
+        <w:t xml:space="preserve">with the GPU idle, the M5 and the RTX 3060 Ti cross at 2.0–2.6 MiB per direction;</w:t>
+      </w:r>
+    </w:p>
+    <w:p>
+      <w:pPr>
+        <w:pStyle w:val="ListParagraph"/>
+        <w:numPr>
+          <w:ilvl w:val="0"/>
+          <w:numId w:val="4"/>
+        </w:numPr>
+      </w:pPr>
+      <w:r>
+        <w:t xml:space="preserve">with the GPU busy, the M5 is ≈ 1.3× faster at 1 MiB and ≈ 1.8× faster at 4–16 MiB, and the crossover lies at or below 256 KiB.</w:t>
+      </w:r>
+    </w:p>
+    <w:p>
+      <w:pPr>
+        <w:pStyle w:val="Normal"/>
+      </w:pPr>
+      <w:r>
+        <w:t xml:space="preserve">The interpolation of Sect. 5, made on the protocol's coarse grid, puts the idle crossover at ≈ 2.4 MiB with ReBAR on, inside the predicted interval, and at ≈ 3.0 MiB with ReBAR off, above it. Nothing was measured between 1 and 4 MiB there; this section measures that range directly.</w:t>
+      </w:r>
+    </w:p>
+    <w:p>
+      <w:pPr>
+        <w:pStyle w:val="Heading2"/>
+        <w:keepNext/>
+      </w:pPr>
+      <w:r>
+        <w:t xml:space="preserve">6.2 Measurement</w:t>
+      </w:r>
+    </w:p>
+    <w:p>
+      <w:pPr>
+        <w:pStyle w:val="Normal"/>
+      </w:pPr>
+      <w:r>
+        <w:t xml:space="preserve">The extension of Sect. 4.6 measures the paths </w:t>
+      </w:r>
+      <w:r>
+        <w:rPr>
+          <w:rStyle w:val="CodeChar"/>
+        </w:rPr>
+        <w:t xml:space="preserve">empty</w:t>
+      </w:r>
+      <w:r>
+        <w:t xml:space="preserve">, </w:t>
+      </w:r>
+      <w:r>
+        <w:rPr>
+          <w:rStyle w:val="CodeChar"/>
+        </w:rPr>
+        <w:t xml:space="preserve">s1_copy</w:t>
+      </w:r>
+      <w:r>
+        <w:t xml:space="preserve"> and </w:t>
+      </w:r>
+      <w:r>
+        <w:rPr>
+          <w:rStyle w:val="CodeChar"/>
+        </w:rPr>
+        <w:t xml:space="preserve">s2_direct</w:t>
+      </w:r>
+      <w:r>
+        <w:t xml:space="preserve"> (and </w:t>
+      </w:r>
+      <w:r>
+        <w:rPr>
+          <w:rStyle w:val="CodeChar"/>
+        </w:rPr>
+        <w:t xml:space="preserve">s2_hostcached</w:t>
+      </w:r>
+      <w:r>
+        <w:t xml:space="preserve"> on Vulkan) on twelve payloads from 4 KiB to 64 MiB, with five points between 1 and 8 MiB where the idle curves are expected to cross. Every cell is measured twice, with the GPU otherwise idle and with the GPU hot (Sect. 4.5), idle cells first, and each series is three process restarts. The crossover is read per platform pair and GPU state by log–log interpolation between the two neighbouring payloads, and its error bar is the spread of that estimate over the pairs of runs. Idle and hot results are reported separately and never pooled. The extension series are kept apart from the Sect. 5 series, and a two-minute reference check of the empty, </w:t>
+      </w:r>
+      <w:r>
+        <w:rPr>
+          <w:rStyle w:val="CodeChar"/>
+        </w:rPr>
+        <w:t xml:space="preserve">s1_copy</w:t>
+      </w:r>
+      <w:r>
+        <w:t xml:space="preserve"> and </w:t>
+      </w:r>
+      <w:r>
+        <w:rPr>
+          <w:rStyle w:val="CodeChar"/>
+        </w:rPr>
+        <w:t xml:space="preserve">s2_direct</w:t>
+      </w:r>
+      <w:r>
+        <w:t xml:space="preserve"> cells against the accepted Sect. 5 levels precedes every M5 series (Sect. 12.2).</w:t>
+      </w:r>
+    </w:p>
+    <w:p>
+      <w:pPr>
+        <w:pStyle w:val="Heading2"/>
+        <w:keepNext/>
+      </w:pPr>
+      <w:r>
+        <w:t xml:space="preserve">6.3 Results</w:t>
+      </w:r>
+    </w:p>
+    <w:p>
+      <w:pPr>
+        <w:pStyle w:val="Normal"/>
+      </w:pPr>
+      <w:r>
+        <w:t xml:space="preserve">[Figure: round trip against payload per direction, idle and hot, both platforms, with the measured crossover bands. Table: crossover per path, GPU state and ReBAR setting with its run-to-run spread, against predictions 1 and 2. Text: whether holding the GPU busy collapses the M5's multimodal CPU→GPU hand-off (Sect. 5), the hot-GPU ratios at 1 MiB and 4–16 MiB, and the verdict on each prediction. Waits for </w:t>
+      </w:r>
+      <w:r>
+        <w:rPr>
+          <w:rStyle w:val="CodeChar"/>
+        </w:rPr>
+        <w:t xml:space="preserve">m1_mac_ext</w:t>
+      </w:r>
+      <w:r>
+        <w:t xml:space="preserve"> and </w:t>
+      </w:r>
+      <w:r>
+        <w:rPr>
+          <w:rStyle w:val="CodeChar"/>
+        </w:rPr>
+        <w:t xml:space="preserve">m1_3060_ext</w:t>
+      </w:r>
+      <w:r>
+        <w:t xml:space="preserve">.]</w:t>
       </w:r>
     </w:p>
     <w:p>
@@ -5220,7 +5363,7 @@
         <w:pStyle w:val="ListParagraph"/>
         <w:numPr>
           <w:ilvl w:val="0"/>
-          <w:numId w:val="4"/>
+          <w:numId w:val="5"/>
         </w:numPr>
       </w:pPr>
       <w:r>
@@ -5232,7 +5375,7 @@
         <w:pStyle w:val="ListParagraph"/>
         <w:numPr>
           <w:ilvl w:val="0"/>
-          <w:numId w:val="4"/>
+          <w:numId w:val="5"/>
         </w:numPr>
       </w:pPr>
       <w:r>
@@ -5262,7 +5405,7 @@
         <w:pStyle w:val="ListParagraph"/>
         <w:numPr>
           <w:ilvl w:val="0"/>
-          <w:numId w:val="4"/>
+          <w:numId w:val="5"/>
         </w:numPr>
       </w:pPr>
       <w:r>
@@ -6249,7 +6392,7 @@
         <w:pStyle w:val="ListParagraph"/>
         <w:numPr>
           <w:ilvl w:val="0"/>
-          <w:numId w:val="5"/>
+          <w:numId w:val="6"/>
         </w:numPr>
       </w:pPr>
       <w:r>
@@ -6277,7 +6420,7 @@
         <w:pStyle w:val="ListParagraph"/>
         <w:numPr>
           <w:ilvl w:val="0"/>
-          <w:numId w:val="5"/>
+          <w:numId w:val="6"/>
         </w:numPr>
       </w:pPr>
       <w:r>
@@ -6305,7 +6448,7 @@
         <w:pStyle w:val="ListParagraph"/>
         <w:numPr>
           <w:ilvl w:val="0"/>
-          <w:numId w:val="5"/>
+          <w:numId w:val="6"/>
         </w:numPr>
       </w:pPr>
       <w:r>
@@ -6324,7 +6467,7 @@
         <w:pStyle w:val="ListParagraph"/>
         <w:numPr>
           <w:ilvl w:val="0"/>
-          <w:numId w:val="5"/>
+          <w:numId w:val="6"/>
         </w:numPr>
       </w:pPr>
       <w:r>
@@ -6380,7 +6523,7 @@
         <w:pStyle w:val="ListParagraph"/>
         <w:numPr>
           <w:ilvl w:val="0"/>
-          <w:numId w:val="5"/>
+          <w:numId w:val="6"/>
         </w:numPr>
       </w:pPr>
       <w:r>
@@ -7101,6 +7244,12 @@
     </w:lvlOverride>
   </w:num>
   <w:num w:numId="5">
+    <w:abstractNumId w:val="1"/>
+    <w:lvlOverride w:ilvl="0">
+      <w:startOverride w:val="1"/>
+    </w:lvlOverride>
+  </w:num>
+  <w:num w:numId="6">
     <w:abstractNumId w:val="1"/>
     <w:lvlOverride w:ilvl="0">
       <w:startOverride w:val="1"/>

</xml_diff>

<commit_message>
paper: the cost-model formula as a Word equation (OMML) in the .docx build
build_docx.py renders a ```formula block as one m:oMathPara (one m:oMath per line): x_sub subscripts
(descriptive ones upright), {num} / {den} fractions, stretched ( ) delimiters, [text] upright. §9.1's
block uses it; the Markdown stays readable. Rebuilt lightbound_jsc.docx (STATUS open ask 11).

Co-Authored-By: Claude Fable 5.1 <noreply@anthropic.com>
</commit_message>
<xml_diff>
--- a/docs/paper/lightbound_jsc.docx
+++ b/docs/paper/lightbound_jsc.docx
@@ -1,6 +1,6 @@
 
 <file path=word/document.xml><?xml version="1.0" encoding="utf-8"?>
-<w:document xmlns:w="http://schemas.openxmlformats.org/wordprocessingml/2006/main" xmlns:r="http://schemas.openxmlformats.org/officeDocument/2006/relationships" xmlns:wp="http://schemas.openxmlformats.org/drawingml/2006/wordprocessingDrawing" xmlns:a="http://schemas.openxmlformats.org/drawingml/2006/main" xmlns:pic="http://schemas.openxmlformats.org/drawingml/2006/picture">
+<w:document xmlns:w="http://schemas.openxmlformats.org/wordprocessingml/2006/main" xmlns:r="http://schemas.openxmlformats.org/officeDocument/2006/relationships" xmlns:wp="http://schemas.openxmlformats.org/drawingml/2006/wordprocessingDrawing" xmlns:a="http://schemas.openxmlformats.org/drawingml/2006/main" xmlns:pic="http://schemas.openxmlformats.org/drawingml/2006/picture" xmlns:m="http://schemas.openxmlformats.org/officeDocument/2006/math">
   <w:body>
     <w:p>
       <w:pPr>
@@ -5490,27 +5490,241 @@
     </w:p>
     <w:p>
       <w:pPr>
-        <w:pStyle w:val="Code"/>
-      </w:pPr>
-      <w:r>
-        <w:t xml:space="preserve">T_frame(N, K, S) ≈ a_gpu·N + b_gpu + a_cpu·N + b_cpu</w:t>
-      </w:r>
-    </w:p>
-    <w:p>
-      <w:pPr>
-        <w:pStyle w:val="Code"/>
-      </w:pPr>
-      <w:r>
-        <w:t xml:space="preserve">                   + K · ( T_sync + (P_g2c(N) + P_c2g(N)) / BW_eff(S) )</w:t>
-      </w:r>
-    </w:p>
-    <w:p>
-      <w:pPr>
-        <w:pStyle w:val="Code"/>
-      </w:pPr>
-      <w:r>
-        <w:t xml:space="preserve">                   + [S1] K · T_copy_setup</w:t>
-      </w:r>
+        <w:pStyle w:val="Normal"/>
+        <w:jc w:val="left"/>
+      </w:pPr>
+      <m:oMathPara>
+        <m:oMathParaPr>
+          <m:jc m:val="left"/>
+        </m:oMathParaPr>
+        <m:oMath>
+          <m:sSub>
+            <m:e>
+              <m:r>
+                <m:t xml:space="preserve">T</m:t>
+              </m:r>
+            </m:e>
+            <m:sub>
+              <m:r>
+                <m:rPr>
+                  <m:sty m:val="p"/>
+                </m:rPr>
+                <m:t xml:space="preserve">frame</m:t>
+              </m:r>
+            </m:sub>
+          </m:sSub>
+          <m:d>
+            <m:e>
+              <m:r>
+                <m:t xml:space="preserve">N, K, S</m:t>
+              </m:r>
+            </m:e>
+          </m:d>
+          <m:r>
+            <m:t xml:space="preserve"> ≈ </m:t>
+          </m:r>
+          <m:sSub>
+            <m:e>
+              <m:r>
+                <m:t xml:space="preserve">a</m:t>
+              </m:r>
+            </m:e>
+            <m:sub>
+              <m:r>
+                <m:rPr>
+                  <m:sty m:val="p"/>
+                </m:rPr>
+                <m:t xml:space="preserve">gpu</m:t>
+              </m:r>
+            </m:sub>
+          </m:sSub>
+          <m:r>
+            <m:t xml:space="preserve"> · N + </m:t>
+          </m:r>
+          <m:sSub>
+            <m:e>
+              <m:r>
+                <m:t xml:space="preserve">b</m:t>
+              </m:r>
+            </m:e>
+            <m:sub>
+              <m:r>
+                <m:rPr>
+                  <m:sty m:val="p"/>
+                </m:rPr>
+                <m:t xml:space="preserve">gpu</m:t>
+              </m:r>
+            </m:sub>
+          </m:sSub>
+          <m:r>
+            <m:t xml:space="preserve"> + </m:t>
+          </m:r>
+          <m:sSub>
+            <m:e>
+              <m:r>
+                <m:t xml:space="preserve">a</m:t>
+              </m:r>
+            </m:e>
+            <m:sub>
+              <m:r>
+                <m:rPr>
+                  <m:sty m:val="p"/>
+                </m:rPr>
+                <m:t xml:space="preserve">cpu</m:t>
+              </m:r>
+            </m:sub>
+          </m:sSub>
+          <m:r>
+            <m:t xml:space="preserve"> · N + </m:t>
+          </m:r>
+          <m:sSub>
+            <m:e>
+              <m:r>
+                <m:t xml:space="preserve">b</m:t>
+              </m:r>
+            </m:e>
+            <m:sub>
+              <m:r>
+                <m:rPr>
+                  <m:sty m:val="p"/>
+                </m:rPr>
+                <m:t xml:space="preserve">cpu</m:t>
+              </m:r>
+            </m:sub>
+          </m:sSub>
+        </m:oMath>
+        <m:oMath>
+          <m:r>
+            <m:t xml:space="preserve">+ K · </m:t>
+          </m:r>
+          <m:d>
+            <m:e>
+              <m:sSub>
+                <m:e>
+                  <m:r>
+                    <m:t xml:space="preserve">T</m:t>
+                  </m:r>
+                </m:e>
+                <m:sub>
+                  <m:r>
+                    <m:rPr>
+                      <m:sty m:val="p"/>
+                    </m:rPr>
+                    <m:t xml:space="preserve">sync</m:t>
+                  </m:r>
+                </m:sub>
+              </m:sSub>
+              <m:r>
+                <m:t xml:space="preserve"> + </m:t>
+              </m:r>
+              <m:f>
+                <m:num>
+                  <m:sSub>
+                    <m:e>
+                      <m:r>
+                        <m:t xml:space="preserve">P</m:t>
+                      </m:r>
+                    </m:e>
+                    <m:sub>
+                      <m:r>
+                        <m:rPr>
+                          <m:sty m:val="p"/>
+                        </m:rPr>
+                        <m:t xml:space="preserve">g2c</m:t>
+                      </m:r>
+                    </m:sub>
+                  </m:sSub>
+                  <m:d>
+                    <m:e>
+                      <m:r>
+                        <m:t xml:space="preserve">N</m:t>
+                      </m:r>
+                    </m:e>
+                  </m:d>
+                  <m:r>
+                    <m:t xml:space="preserve"> + </m:t>
+                  </m:r>
+                  <m:sSub>
+                    <m:e>
+                      <m:r>
+                        <m:t xml:space="preserve">P</m:t>
+                      </m:r>
+                    </m:e>
+                    <m:sub>
+                      <m:r>
+                        <m:rPr>
+                          <m:sty m:val="p"/>
+                        </m:rPr>
+                        <m:t xml:space="preserve">c2g</m:t>
+                      </m:r>
+                    </m:sub>
+                  </m:sSub>
+                  <m:d>
+                    <m:e>
+                      <m:r>
+                        <m:t xml:space="preserve">N</m:t>
+                      </m:r>
+                    </m:e>
+                  </m:d>
+                </m:num>
+                <m:den>
+                  <m:sSub>
+                    <m:e>
+                      <m:r>
+                        <m:t xml:space="preserve">BW</m:t>
+                      </m:r>
+                    </m:e>
+                    <m:sub>
+                      <m:r>
+                        <m:rPr>
+                          <m:sty m:val="p"/>
+                        </m:rPr>
+                        <m:t xml:space="preserve">eff</m:t>
+                      </m:r>
+                    </m:sub>
+                  </m:sSub>
+                  <m:d>
+                    <m:e>
+                      <m:r>
+                        <m:t xml:space="preserve">S</m:t>
+                      </m:r>
+                    </m:e>
+                  </m:d>
+                </m:den>
+              </m:f>
+            </m:e>
+          </m:d>
+        </m:oMath>
+        <m:oMath>
+          <m:r>
+            <m:t xml:space="preserve">+ </m:t>
+          </m:r>
+          <m:r>
+            <m:rPr>
+              <m:sty m:val="p"/>
+            </m:rPr>
+            <m:t xml:space="preserve">[S1]</m:t>
+          </m:r>
+          <m:r>
+            <m:t xml:space="preserve"> K · </m:t>
+          </m:r>
+          <m:sSub>
+            <m:e>
+              <m:r>
+                <m:t xml:space="preserve">T</m:t>
+              </m:r>
+            </m:e>
+            <m:sub>
+              <m:r>
+                <m:rPr>
+                  <m:sty m:val="p"/>
+                </m:rPr>
+                <m:t xml:space="preserve">copy setup</m:t>
+              </m:r>
+            </m:sub>
+          </m:sSub>
+        </m:oMath>
+      </m:oMathPara>
     </w:p>
     <w:p>
       <w:pPr>
@@ -7142,7 +7356,7 @@
 </file>
 
 <file path=word/footer1.xml><?xml version="1.0" encoding="utf-8"?>
-<w:ftr xmlns:w="http://schemas.openxmlformats.org/wordprocessingml/2006/main" xmlns:r="http://schemas.openxmlformats.org/officeDocument/2006/relationships" xmlns:wp="http://schemas.openxmlformats.org/drawingml/2006/wordprocessingDrawing" xmlns:a="http://schemas.openxmlformats.org/drawingml/2006/main" xmlns:pic="http://schemas.openxmlformats.org/drawingml/2006/picture">
+<w:ftr xmlns:w="http://schemas.openxmlformats.org/wordprocessingml/2006/main" xmlns:r="http://schemas.openxmlformats.org/officeDocument/2006/relationships" xmlns:wp="http://schemas.openxmlformats.org/drawingml/2006/wordprocessingDrawing" xmlns:a="http://schemas.openxmlformats.org/drawingml/2006/main" xmlns:pic="http://schemas.openxmlformats.org/drawingml/2006/picture" xmlns:m="http://schemas.openxmlformats.org/officeDocument/2006/math">
   <w:p>
     <w:pPr>
       <w:jc w:val="center"/>
@@ -7167,7 +7381,7 @@
 </file>
 
 <file path=word/numbering.xml><?xml version="1.0" encoding="utf-8"?>
-<w:numbering xmlns:w="http://schemas.openxmlformats.org/wordprocessingml/2006/main" xmlns:r="http://schemas.openxmlformats.org/officeDocument/2006/relationships" xmlns:wp="http://schemas.openxmlformats.org/drawingml/2006/wordprocessingDrawing" xmlns:a="http://schemas.openxmlformats.org/drawingml/2006/main" xmlns:pic="http://schemas.openxmlformats.org/drawingml/2006/picture">
+<w:numbering xmlns:w="http://schemas.openxmlformats.org/wordprocessingml/2006/main" xmlns:r="http://schemas.openxmlformats.org/officeDocument/2006/relationships" xmlns:wp="http://schemas.openxmlformats.org/drawingml/2006/wordprocessingDrawing" xmlns:a="http://schemas.openxmlformats.org/drawingml/2006/main" xmlns:pic="http://schemas.openxmlformats.org/drawingml/2006/picture" xmlns:m="http://schemas.openxmlformats.org/officeDocument/2006/math">
   <w:abstractNum w:abstractNumId="0">
     <w:multiLevelType w:val="hybridMultilevel"/>
     <w:lvl w:ilvl="0">
@@ -7259,7 +7473,7 @@
 </file>
 
 <file path=word/styles.xml><?xml version="1.0" encoding="utf-8"?>
-<w:styles xmlns:w="http://schemas.openxmlformats.org/wordprocessingml/2006/main" xmlns:r="http://schemas.openxmlformats.org/officeDocument/2006/relationships" xmlns:wp="http://schemas.openxmlformats.org/drawingml/2006/wordprocessingDrawing" xmlns:a="http://schemas.openxmlformats.org/drawingml/2006/main" xmlns:pic="http://schemas.openxmlformats.org/drawingml/2006/picture">
+<w:styles xmlns:w="http://schemas.openxmlformats.org/wordprocessingml/2006/main" xmlns:r="http://schemas.openxmlformats.org/officeDocument/2006/relationships" xmlns:wp="http://schemas.openxmlformats.org/drawingml/2006/wordprocessingDrawing" xmlns:a="http://schemas.openxmlformats.org/drawingml/2006/main" xmlns:pic="http://schemas.openxmlformats.org/drawingml/2006/picture" xmlns:m="http://schemas.openxmlformats.org/officeDocument/2006/math">
   <w:docDefaults>
     <w:rPrDefault>
       <w:rPr>

</xml_diff>

<commit_message>
paper: §12.2 item 5 and §1 updated with the 10-22 QoS/priority retest (scheduling ruled out; the spin-wait shift tracks the SoC clock on an idle Mac); .docx rebuilt
Co-Authored-By: Claude Fable 5.1 <noreply@anthropic.com>
</commit_message>
<xml_diff>
--- a/docs/paper/lightbound_jsc.docx
+++ b/docs/paper/lightbound_jsc.docx
@@ -582,14 +582,14 @@
         </w:numPr>
       </w:pPr>
       <w:r>
-        <w:t xml:space="preserve">A practical account of measurement hygiene for microsecond-scale GPU latency on a laptop-class SoC. Background GPU clients, CPU contention and an undetected dark wake cost us runs, and a shift of 100–280 µs in spin-wait round trips survived every power, display, wake and launch condition we tried (Sect. 12). </w:t>
+        <w:t xml:space="preserve">A practical account of measurement hygiene for microsecond-scale GPU latency on a laptop-class SoC. Background GPU clients, CPU contention and an undetected dark wake cost us runs, and a shift of 100–280 µs in spin-wait round trips survived every power, display, wake, launch and scheduling condition we tried, until the processor clock explained most of it: on an otherwise idle laptop a lone spin-waiting thread runs slower than the same thread beside a background load (Sect. 12). </w:t>
       </w:r>
       <w:r>
         <w:rPr>
           <w:i/>
           <w:iCs/>
         </w:rPr>
-        <w:t xml:space="preserve">(evidence in hand; the shift's cause is still open, 2026-10-21)</w:t>
+        <w:t xml:space="preserve">(evidence in hand; a per-thread clock trace and the protocol's response are open, 2026-10-23)</w:t>
       </w:r>
     </w:p>
     <w:p>
@@ -6745,7 +6745,7 @@
           <w:b/>
           <w:bCs/>
         </w:rPr>
-        <w:t xml:space="preserve">A persistent shift we have not explained.</w:t>
+        <w:t xml:space="preserve">A persistent shift, traced to the processor clock on an idle machine.</w:t>
       </w:r>
       <w:r>
         <w:t xml:space="preserve"> Since at least 2026-10-17, every check on the M5 has measured </w:t>
@@ -6777,7 +6777,7 @@
         <w:t xml:space="preserve">Block-wait</w:t>
       </w:r>
       <w:r>
-        <w:t xml:space="preserve"> cells are unaffected: within 11 µs at 4 KiB, and 84–140 µs faster at 1 MiB. In spin mode, the work on both processors slows down: the CPU's own read of 1 MiB takes 45 vs 14 µs and the GPU's 1 MiB copy 65 vs 21 µs. Each of the following was ruled out by a direct comparison: the binary (the accepted series' commit, rebuilt and alternated with the current binary, agrees within 2 %); the power supply (20 W and 40 W, item 1); the external display and display activity (internal panel only, and all displays asleep); dark versus full wake (item 4); the process's nice level (0 vs 5); and the launch context (a terminal application, as for the accepted series, versus a detached terminal-session service: four alternating runs each, spin cells +109–243 vs +111–262 µs). One process-level clue: the benchmark spent only 68–90 % of its CPU time on the performance cores, and across eight runs the share correlates with the empty spin round trip (r = −0.89; the 90 % run measured 299 µs against 434–471 µs). This is consistent with the spinning thread being placed on efficiency cores part of the time, but whole-process counters cannot show it. Consequences: the accepted M5 idle numbers (Sect. 5) describe a machine state that we can no longer reproduce, and whether that state or the present one is typical of the platform is open. Sect. 5's verdict does not depend on it. In the present state the M5's block-wait cells are still slower than the 3060 Ti's best path (</w:t>
+        <w:t xml:space="preserve"> cells are unaffected: within 13 µs at 4 KiB, and 62–140 µs faster at 1 MiB. In spin mode, the work on both processors slows down: the CPU's own read of 1 MiB takes 45 vs 14 µs and the GPU's 1 MiB copy 65 vs 21 µs. Each of the following was ruled out by a direct comparison: the binary (the accepted series' commit, rebuilt and alternated with the current binary, agrees within 2 %); the power supply (20 W and 40 W, item 1); the external display and display activity (internal panel only, and all displays asleep); dark versus full wake (item 4); the process's nice level (0 vs 5); the launch context (a terminal application, as for the accepted series, versus a detached terminal-session service: four alternating runs each, spin cells +109–243 vs +111–262 µs); and the benchmark thread's scheduling class and priority (a user-interactive QoS request plus a base priority of 47 against the default 31, alternated with the default over eight runs: the two agree within 12 µs on 16 of 20 cells, and the other four follow the run order, not the flag). What did move the cells was the clock. In that last series the first three runs executed at 2.2 GHz averaged over the process (exit resource counters: performance cores 2.6–2.8 GHz, efficiency cores 1.4–1.5 GHz) and showed the usual +170–290 µs. From the fourth run on, a macOS housekeeping process (iCloud file sync after a reboot, about half a core for four minutes) raised the load average from 1–2 to about 4 and the process clock to 2.8–3.2 GHz, and the spin cells sped up without any change on our side: the empty cells fell to the accepted levels or below (chained, 101–130 µs in the two fastest runs against 249), the </w:t>
       </w:r>
       <w:r>
         <w:rPr>
@@ -6786,7 +6786,7 @@
         <w:t xml:space="preserve">s2_direct</w:t>
       </w:r>
       <w:r>
-        <w:t xml:space="preserve"> 1 MiB, chained, p50 205–222 vs 145–161 µs; on the PC, block and spin wait differ by ≤ 6 µs). The interpolated crossover does depend on it: it rests on the M5's 1 MiB level and would move to smaller payloads if the present block-wait level held. No M5 extension series is measured until a two-minute reference check of the empty, </w:t>
+        <w:t xml:space="preserve"> 4 KiB cells reached them in the last runs (210–214 against 201), and the </w:t>
       </w:r>
       <w:r>
         <w:rPr>
@@ -6795,7 +6795,7 @@
         <w:t xml:space="preserve">s1_copy</w:t>
       </w:r>
       <w:r>
-        <w:t xml:space="preserve"> and </w:t>
+        <w:t xml:space="preserve"> 4 KiB cells closed only part of the gap. Across the eight runs the spin round trips correlate with the clock (r = −0.81 to −0.95 for five of the six empty and 4 KiB cells, −0.58 for the sixth) and only weakly with the share of CPU time spent on performance cores (−0.52 to +0.16 for the same cells), which an earlier series had suggested as the cause. The 1 MiB spin cells stayed +180–230 µs in all but one run, so they carry a second component, the slow 1 MiB read in spin mode, that the clock alone does not remove. Our reading, not yet confirmed by a per-thread clock trace (root-level power sampling during a run is planned): on an otherwise idle M5 the governor leaves a lone spin-waiting thread at about 2.2 GHz, and another process's load raises the clock that the benchmark thread then shares. The accepted series ran with the chassis at thermal state "fair", that is with the machine busier than during any of our checks, which would make "what changed" the machine's background activity rather than a setting. Consequences: the M5's idle spin-wait numbers (Sect. 5) are governor-dependent, and a quiet machine is not the fastest machine for them. Sect. 5's verdict does not depend on it: in the present state the M5's block-wait cells are still slower than the 3060 Ti's best path (</w:t>
       </w:r>
       <w:r>
         <w:rPr>
@@ -6804,7 +6804,7 @@
         <w:t xml:space="preserve">s2_direct</w:t>
       </w:r>
       <w:r>
-        <w:t xml:space="preserve"> cells reproduces the accepted levels.</w:t>
+        <w:t xml:space="preserve"> 1 MiB, chained, p50 205–222 vs 145–161 µs; on the PC, block and spin wait differ by ≤ 6 µs). The interpolated crossover does depend on it: it rests on the M5's 1 MiB level and would move to smaller payloads if the present block-wait level held. Two responses are open: re-measure the idle reference in the present state and report the spin-wait cells as clock-dependent, or make a defined CPU-side companion load part of the microbenchmark condition, which is closer to the game, whose simulation thread never spins alone. No M5 extension series is measured before that decision.</w:t>
       </w:r>
     </w:p>
     <w:p>
@@ -6812,7 +6812,7 @@
         <w:pStyle w:val="Normal"/>
       </w:pPr>
       <w:r>
-        <w:t xml:space="preserve">In each case the first minute of cells showed the problem against the accepted levels, and the attempt was stopped and discarded, never repaired or pooled. A practical lesson for latency studies on laptops: "on AC", "idle" and "awake" have to be checked by measurement, not assumed, and a reference check before every series catches what the checklist misses.</w:t>
+        <w:t xml:space="preserve">In each case the first minute of cells showed the problem against the accepted levels, and the attempt was stopped and discarded, never repaired or pooled. A practical lesson for latency studies on laptops: "on AC", "idle" and "awake" have to be checked by measurement, not assumed, and a reference check before every series catches what the checklist misses. "Idle" also cuts both ways on a laptop-class SoC: a lone busy thread on a quiet machine can run at a lower clock than the same thread beside a background load, so single-thread latencies need the effective clock recorded next to them.</w:t>
       </w:r>
     </w:p>
     <w:p>
@@ -6859,7 +6859,7 @@
         <w:t xml:space="preserve">Thermal state.</w:t>
       </w:r>
       <w:r>
-        <w:t xml:space="preserve"> The fanless chassis can throttle. Each series logs the thermal state at start and end. The accepted Mac series stayed at "fair" throughout, and the protocol flags throttled runs. Idle cells run before hot cells, because idle blocks measured after loaded ones come out faster (hysteresis, DECISIONS #32).</w:t>
+        <w:t xml:space="preserve"> The fanless chassis can throttle. Each series logs the thermal state at start and end. The accepted Mac series stayed at "fair" throughout (in hindsight also a sign that the machine was not idle then, Sect. 12.2 item 5), and the protocol flags throttled runs. Idle cells run before hot cells, because idle blocks measured after loaded ones come out faster (hysteresis, DECISIONS #32).</w:t>
       </w:r>
     </w:p>
     <w:p>

</xml_diff>

<commit_message>
paper: Declarations draft (declarations.md, read by build_docx.py); methods TODO closed; all 18 reference DOIs/URLs resolve (10-23 check)
Co-Authored-By: Claude Fable 5.1 <noreply@anthropic.com>
</commit_message>
<xml_diff>
--- a/docs/paper/lightbound_jsc.docx
+++ b/docs/paper/lightbound_jsc.docx
@@ -7024,7 +7024,7 @@
         <w:t xml:space="preserve">Funding. </w:t>
       </w:r>
       <w:r>
-        <w:t xml:space="preserve">[None / to state.]</w:t>
+        <w:t xml:space="preserve">[No funding was received for this work. / to state]</w:t>
       </w:r>
     </w:p>
     <w:p>
@@ -7051,10 +7051,10 @@
           <w:b/>
           <w:bCs/>
         </w:rPr>
-        <w:t xml:space="preserve">Data and code availability. </w:t>
-      </w:r>
-      <w:r>
-        <w:t xml:space="preserve">The benchmark, the simulation, the analysis scripts and the measured series are in the public repository https://github.com/jttarigan/Lightbound [archived DOI: to decide].</w:t>
+        <w:t xml:space="preserve">Ethics approval and consent to participate. </w:t>
+      </w:r>
+      <w:r>
+        <w:t xml:space="preserve">Not applicable: the study involves no human or animal participants.</w:t>
       </w:r>
     </w:p>
     <w:p>
@@ -7066,10 +7066,118 @@
           <w:b/>
           <w:bCs/>
         </w:rPr>
+        <w:t xml:space="preserve">Data availability. </w:t>
+      </w:r>
+      <w:r>
+        <w:t xml:space="preserve">The measured series behind every number in this paper are in the public repository https://github.com/jttarigan/Lightbound under </w:t>
+      </w:r>
+      <w:r>
+        <w:rPr>
+          <w:rStyle w:val="CodeChar"/>
+        </w:rPr>
+        <w:t xml:space="preserve">results/</w:t>
+      </w:r>
+      <w:r>
+        <w:t xml:space="preserve">: the per-iteration CSV files of the microbenchmark with their environment headers, the pooled summaries and reports (</w:t>
+      </w:r>
+      <w:r>
+        <w:rPr>
+          <w:rStyle w:val="CodeChar"/>
+        </w:rPr>
+        <w:t xml:space="preserve">results/m1_report</w:t>
+      </w:r>
+      <w:r>
+        <w:t xml:space="preserve">, </w:t>
+      </w:r>
+      <w:r>
+        <w:rPr>
+          <w:rStyle w:val="CodeChar"/>
+        </w:rPr>
+        <w:t xml:space="preserve">results/m1_report_rebar-off</w:t>
+      </w:r>
+      <w:r>
+        <w:t xml:space="preserve">), the crossover tables (</w:t>
+      </w:r>
+      <w:r>
+        <w:rPr>
+          <w:rStyle w:val="CodeChar"/>
+        </w:rPr>
+        <w:t xml:space="preserve">results/m1_crossover</w:t>
+      </w:r>
+      <w:r>
+        <w:t xml:space="preserve">) and the diagnostic checks of Sect. 12.2 (</w:t>
+      </w:r>
+      <w:r>
+        <w:rPr>
+          <w:rStyle w:val="CodeChar"/>
+        </w:rPr>
+        <w:t xml:space="preserve">results/m1_mac_20w_check</w:t>
+      </w:r>
+      <w:r>
+        <w:t xml:space="preserve">, </w:t>
+      </w:r>
+      <w:r>
+        <w:rPr>
+          <w:rStyle w:val="CodeChar"/>
+        </w:rPr>
+        <w:t xml:space="preserve">results/m1_mac_40w_check</w:t>
+      </w:r>
+      <w:r>
+        <w:t xml:space="preserve">). [An archived snapshot with a DOI (Zenodo) at submission: to decide.]</w:t>
+      </w:r>
+    </w:p>
+    <w:p>
+      <w:pPr>
+        <w:pStyle w:val="Normal"/>
+      </w:pPr>
+      <w:r>
+        <w:rPr>
+          <w:b/>
+          <w:bCs/>
+        </w:rPr>
+        <w:t xml:space="preserve">Code availability. </w:t>
+      </w:r>
+      <w:r>
+        <w:t xml:space="preserve">The benchmark, the simulation, the shader sources, the analysis scripts (</w:t>
+      </w:r>
+      <w:r>
+        <w:rPr>
+          <w:rStyle w:val="CodeChar"/>
+        </w:rPr>
+        <w:t xml:space="preserve">tools/analysis/</w:t>
+      </w:r>
+      <w:r>
+        <w:t xml:space="preserve">) and the build files are in the same repository; the commit measured for each series is recorded in that series' report, and the macOS and Windows binaries are built from one source tree with CMake (Sect. 4). [Licence: the repository has no licence file yet; to choose before submission.]</w:t>
+      </w:r>
+    </w:p>
+    <w:p>
+      <w:pPr>
+        <w:pStyle w:val="Normal"/>
+      </w:pPr>
+      <w:r>
+        <w:rPr>
+          <w:b/>
+          <w:bCs/>
+        </w:rPr>
+        <w:t xml:space="preserve">Author contributions. </w:t>
+      </w:r>
+      <w:r>
+        <w:t xml:space="preserve">Single author. [Entered in the submission system.]</w:t>
+      </w:r>
+    </w:p>
+    <w:p>
+      <w:pPr>
+        <w:pStyle w:val="Normal"/>
+      </w:pPr>
+      <w:r>
+        <w:rPr>
+          <w:b/>
+          <w:bCs/>
+        </w:rPr>
         <w:t xml:space="preserve">Use of AI tools. </w:t>
       </w:r>
       <w:r>
-        <w:t xml:space="preserve">[Wording: the author's decision. Springer Nature asks for AI use beyond copy-editing to be declared in the Methods section; this draft was written with an AI assistant.]</w:t>
+        <w:t xml:space="preserve">[Wording = the user's decision; Springer Nature asks for use beyond copy-editing to be declared in the Methods section. Proposed text, to move into Sect. 4 if adopted: "The author used an AI assistant (Claude, Anthropic) to draft code, analysis scripts and manuscript text under the author's direction. The author designed the study, fixed the hypotheses in advance, ran every measurement, checked every number against the recorded data and takes responsibility for the content."]</w:t>
       </w:r>
     </w:p>
     <w:p>

</xml_diff>

<commit_message>
paper: Huebner25 cited as the published IPDPSW 2025 paper (Zotero item patched in place, DOI 10.1109/ipdpsw66978.2025.00013); 'shared physical memory' wording in the platform tables; .docx rebuilt with --sync
Co-Authored-By: Claude Fable 5.1 <noreply@anthropic.com>
</commit_message>
<xml_diff>
--- a/docs/paper/lightbound_jsc.docx
+++ b/docs/paper/lightbound_jsc.docx
@@ -158,7 +158,7 @@
         <w:fldChar w:fldCharType="begin"/>
       </w:r>
       <w:r>
-        <w:instrText xml:space="preserve"> ADDIN ZOTERO_ITEM CSL_CITATION {"citationID":"a908fbd5","properties":{"formattedCitation":"[3, 4]","plainCitation":"[3, 4]","noteIndex":0},"citationItems":[{"id":"B5Q9E3C9","uris":["http://zotero.org/users/5591478/items/B5Q9E3C9"],"itemData":{"id":"B5Q9E3C9","type":"article","DOI":"10.48550/arXiv.2502.05317","note":"Citation Key: Huebner25","number":"arXiv:2502.05317","publisher":"arXiv","title":"Apple vs. Oranges: Evaluating the Apple Silicon M-Series SoCs for HPC Performance and Efficiency","URL":"https://arxiv.org/abs/2502.05317","author":[{"family":"Hübner","given":"Paul"},{"family":"Hu","given":"Andong"},{"family":"Peng","given":"Ivy"},{"family":"Markidis","given":"Stefano"}],"issued":{"date-parts":[[2025]]}}},{"id":"9RHUAUDT","uris":["http://zotero.org/users/5591478/items/9RHUAUDT"],"itemData":{"id":"9RHUAUDT","type":"paper-conference","collection-title":"DaMoN ’26","container-title":"Proceedings of the 22nd International Workshop on Data Management on New Hardware","DOI":"10.1145/3789237.3809127","note":"Citation Key: Beischl26","page":"1-10","publisher":"ACM","title":"Evaluating Apple Silicon for Data Processing","URL":"https://doi.org/10.1145/3789237.3809127","author":[{"family":"Beischl","given":"Alexander"},{"family":"Morozov","given":"Mykola"},{"family":"Jungmair","given":"Michael"},{"family":"Haussmann","given":"Lukas"},{"family":"Neumann","given":"Thomas"}],"issued":{"date-parts":[[2026,5]]}}}],"schema":"https://github.com/citation-style-language/schema/raw/master/csl-citation.json"} </w:instrText>
+        <w:instrText xml:space="preserve"> ADDIN ZOTERO_ITEM CSL_CITATION {"citationID":"a908fbd5","properties":{"formattedCitation":"[3, 4]","plainCitation":"[3, 4]","noteIndex":0},"citationItems":[{"id":"B5Q9E3C9","uris":["http://zotero.org/users/5591478/items/B5Q9E3C9"],"itemData":{"id":"B5Q9E3C9","type":"paper-conference","container-title":"2025 IEEE International Parallel and Distributed Processing Symposium Workshops (IPDPSW)","DOI":"10.1109/ipdpsw66978.2025.00013","note":"Citation Key: Huebner25\narXiv: 2502.05317","page":"45-54","publisher":"IEEE","title":"Apple vs. Oranges: Evaluating the Apple Silicon M-Series SoCs for HPC Performance and Efficiency","URL":"https://doi.org/10.1109/ipdpsw66978.2025.00013","author":[{"family":"Hübner","given":"Paul"},{"family":"Hu","given":"Andong"},{"family":"Peng","given":"Ivy"},{"family":"Markidis","given":"Stefano"}],"issued":{"date-parts":[[2025,6,3]]}}},{"id":"9RHUAUDT","uris":["http://zotero.org/users/5591478/items/9RHUAUDT"],"itemData":{"id":"9RHUAUDT","type":"paper-conference","collection-title":"DaMoN ’26","container-title":"Proceedings of the 22nd International Workshop on Data Management on New Hardware","DOI":"10.1145/3789237.3809127","note":"Citation Key: Beischl26","page":"1-10","publisher":"ACM","title":"Evaluating Apple Silicon for Data Processing","URL":"https://doi.org/10.1145/3789237.3809127","author":[{"family":"Beischl","given":"Alexander"},{"family":"Morozov","given":"Mykola"},{"family":"Jungmair","given":"Michael"},{"family":"Haussmann","given":"Lukas"},{"family":"Neumann","given":"Thomas"}],"issued":{"date-parts":[[2026,5]]}}}],"schema":"https://github.com/citation-style-language/schema/raw/master/csl-citation.json"} </w:instrText>
       </w:r>
       <w:r>
         <w:fldChar w:fldCharType="separate"/>
@@ -194,7 +194,7 @@
         <w:fldChar w:fldCharType="begin"/>
       </w:r>
       <w:r>
-        <w:instrText xml:space="preserve"> ADDIN ZOTERO_ITEM CSL_CITATION {"citationID":"18846f58","properties":{"formattedCitation":"[1–3]","plainCitation":"[1–3]","noteIndex":0},"citationItems":[{"id":"MF5ZZ8WX","uris":["http://zotero.org/users/5591478/items/MF5ZZ8WX"],"itemData":{"id":"MF5ZZ8WX","type":"paper-conference","collection-title":"ICPP ’24","container-title":"Proceedings of the 53rd International Conference on Parallel Processing","DOI":"10.1145/3673038.3673110","note":"Citation Key: Schieffer24","page":"199-209","publisher":"ACM","title":"Harnessing Integrated CPU-GPU System Memory for HPC: a first look into Grace Hopper","URL":"https://doi.org/10.1145/3673038.3673110","author":[{"family":"Schieffer","given":"Gabin"},{"family":"Wahlgren","given":"Jacob"},{"family":"Ren","given":"Jie"},{"family":"Faj","given":"Jennifer"},{"family":"Peng","given":"Ivy"}],"issued":{"date-parts":[[2024,8]]}}},{"id":"Z6B26CZ6","uris":["http://zotero.org/users/5591478/items/Z6B26CZ6"],"itemData":{"id":"Z6B26CZ6","type":"paper-conference","container-title":"2025 IEEE International Symposium on Workload Characterization (IISWC)","DOI":"10.1109/iiswc66894.2025.00038","note":"Citation Key: Wahlgren25","page":"368-380","publisher":"IEEE","title":"Dissecting CPU-GPU Unified Physical Memory on AMD MI300A APUs","URL":"https://doi.org/10.1109/iiswc66894.2025.00038","author":[{"family":"Wahlgren","given":"Jacob"},{"family":"Schieffer","given":"Gabin"},{"family":"Shi","given":"Ruimin"},{"family":"León","given":"Edgar A."},{"family":"Pearce","given":"Roger"},{"family":"Gokhale","given":"Maya"},{"family":"Peng","given":"Ivy"}],"issued":{"date-parts":[[2025,10]]}}},{"id":"B5Q9E3C9","uris":["http://zotero.org/users/5591478/items/B5Q9E3C9"],"itemData":{"id":"B5Q9E3C9","type":"article","DOI":"10.48550/arXiv.2502.05317","note":"Citation Key: Huebner25","number":"arXiv:2502.05317","publisher":"arXiv","title":"Apple vs. Oranges: Evaluating the Apple Silicon M-Series SoCs for HPC Performance and Efficiency","URL":"https://arxiv.org/abs/2502.05317","author":[{"family":"Hübner","given":"Paul"},{"family":"Hu","given":"Andong"},{"family":"Peng","given":"Ivy"},{"family":"Markidis","given":"Stefano"}],"issued":{"date-parts":[[2025]]}}}],"schema":"https://github.com/citation-style-language/schema/raw/master/csl-citation.json"} </w:instrText>
+        <w:instrText xml:space="preserve"> ADDIN ZOTERO_ITEM CSL_CITATION {"citationID":"18846f58","properties":{"formattedCitation":"[1–3]","plainCitation":"[1–3]","noteIndex":0},"citationItems":[{"id":"MF5ZZ8WX","uris":["http://zotero.org/users/5591478/items/MF5ZZ8WX"],"itemData":{"id":"MF5ZZ8WX","type":"paper-conference","collection-title":"ICPP ’24","container-title":"Proceedings of the 53rd International Conference on Parallel Processing","DOI":"10.1145/3673038.3673110","note":"Citation Key: Schieffer24","page":"199-209","publisher":"ACM","title":"Harnessing Integrated CPU-GPU System Memory for HPC: a first look into Grace Hopper","URL":"https://doi.org/10.1145/3673038.3673110","author":[{"family":"Schieffer","given":"Gabin"},{"family":"Wahlgren","given":"Jacob"},{"family":"Ren","given":"Jie"},{"family":"Faj","given":"Jennifer"},{"family":"Peng","given":"Ivy"}],"issued":{"date-parts":[[2024,8]]}}},{"id":"Z6B26CZ6","uris":["http://zotero.org/users/5591478/items/Z6B26CZ6"],"itemData":{"id":"Z6B26CZ6","type":"paper-conference","container-title":"2025 IEEE International Symposium on Workload Characterization (IISWC)","DOI":"10.1109/iiswc66894.2025.00038","note":"Citation Key: Wahlgren25","page":"368-380","publisher":"IEEE","title":"Dissecting CPU-GPU Unified Physical Memory on AMD MI300A APUs","URL":"https://doi.org/10.1109/iiswc66894.2025.00038","author":[{"family":"Wahlgren","given":"Jacob"},{"family":"Schieffer","given":"Gabin"},{"family":"Shi","given":"Ruimin"},{"family":"León","given":"Edgar A."},{"family":"Pearce","given":"Roger"},{"family":"Gokhale","given":"Maya"},{"family":"Peng","given":"Ivy"}],"issued":{"date-parts":[[2025,10]]}}},{"id":"B5Q9E3C9","uris":["http://zotero.org/users/5591478/items/B5Q9E3C9"],"itemData":{"id":"B5Q9E3C9","type":"paper-conference","container-title":"2025 IEEE International Parallel and Distributed Processing Symposium Workshops (IPDPSW)","DOI":"10.1109/ipdpsw66978.2025.00013","note":"Citation Key: Huebner25\narXiv: 2502.05317","page":"45-54","publisher":"IEEE","title":"Apple vs. Oranges: Evaluating the Apple Silicon M-Series SoCs for HPC Performance and Efficiency","URL":"https://doi.org/10.1109/ipdpsw66978.2025.00013","author":[{"family":"Hübner","given":"Paul"},{"family":"Hu","given":"Andong"},{"family":"Peng","given":"Ivy"},{"family":"Markidis","given":"Stefano"}],"issued":{"date-parts":[[2025,6,3]]}}}],"schema":"https://github.com/citation-style-language/schema/raw/master/csl-citation.json"} </w:instrText>
       </w:r>
       <w:r>
         <w:fldChar w:fldCharType="separate"/>
@@ -850,7 +850,7 @@
         <w:fldChar w:fldCharType="begin"/>
       </w:r>
       <w:r>
-        <w:instrText xml:space="preserve"> ADDIN ZOTERO_ITEM CSL_CITATION {"citationID":"b4bcae2c","properties":{"formattedCitation":"[2–4]","plainCitation":"[2–4]","noteIndex":0},"citationItems":[{"id":"Z6B26CZ6","uris":["http://zotero.org/users/5591478/items/Z6B26CZ6"],"itemData":{"id":"Z6B26CZ6","type":"paper-conference","container-title":"2025 IEEE International Symposium on Workload Characterization (IISWC)","DOI":"10.1109/iiswc66894.2025.00038","note":"Citation Key: Wahlgren25","page":"368-380","publisher":"IEEE","title":"Dissecting CPU-GPU Unified Physical Memory on AMD MI300A APUs","URL":"https://doi.org/10.1109/iiswc66894.2025.00038","author":[{"family":"Wahlgren","given":"Jacob"},{"family":"Schieffer","given":"Gabin"},{"family":"Shi","given":"Ruimin"},{"family":"León","given":"Edgar A."},{"family":"Pearce","given":"Roger"},{"family":"Gokhale","given":"Maya"},{"family":"Peng","given":"Ivy"}],"issued":{"date-parts":[[2025,10]]}}},{"id":"B5Q9E3C9","uris":["http://zotero.org/users/5591478/items/B5Q9E3C9"],"itemData":{"id":"B5Q9E3C9","type":"article","DOI":"10.48550/arXiv.2502.05317","note":"Citation Key: Huebner25","number":"arXiv:2502.05317","publisher":"arXiv","title":"Apple vs. Oranges: Evaluating the Apple Silicon M-Series SoCs for HPC Performance and Efficiency","URL":"https://arxiv.org/abs/2502.05317","author":[{"family":"Hübner","given":"Paul"},{"family":"Hu","given":"Andong"},{"family":"Peng","given":"Ivy"},{"family":"Markidis","given":"Stefano"}],"issued":{"date-parts":[[2025]]}}},{"id":"9RHUAUDT","uris":["http://zotero.org/users/5591478/items/9RHUAUDT"],"itemData":{"id":"9RHUAUDT","type":"paper-conference","collection-title":"DaMoN ’26","container-title":"Proceedings of the 22nd International Workshop on Data Management on New Hardware","DOI":"10.1145/3789237.3809127","note":"Citation Key: Beischl26","page":"1-10","publisher":"ACM","title":"Evaluating Apple Silicon for Data Processing","URL":"https://doi.org/10.1145/3789237.3809127","author":[{"family":"Beischl","given":"Alexander"},{"family":"Morozov","given":"Mykola"},{"family":"Jungmair","given":"Michael"},{"family":"Haussmann","given":"Lukas"},{"family":"Neumann","given":"Thomas"}],"issued":{"date-parts":[[2026,5]]}}}],"schema":"https://github.com/citation-style-language/schema/raw/master/csl-citation.json"} </w:instrText>
+        <w:instrText xml:space="preserve"> ADDIN ZOTERO_ITEM CSL_CITATION {"citationID":"b4bcae2c","properties":{"formattedCitation":"[2–4]","plainCitation":"[2–4]","noteIndex":0},"citationItems":[{"id":"Z6B26CZ6","uris":["http://zotero.org/users/5591478/items/Z6B26CZ6"],"itemData":{"id":"Z6B26CZ6","type":"paper-conference","container-title":"2025 IEEE International Symposium on Workload Characterization (IISWC)","DOI":"10.1109/iiswc66894.2025.00038","note":"Citation Key: Wahlgren25","page":"368-380","publisher":"IEEE","title":"Dissecting CPU-GPU Unified Physical Memory on AMD MI300A APUs","URL":"https://doi.org/10.1109/iiswc66894.2025.00038","author":[{"family":"Wahlgren","given":"Jacob"},{"family":"Schieffer","given":"Gabin"},{"family":"Shi","given":"Ruimin"},{"family":"León","given":"Edgar A."},{"family":"Pearce","given":"Roger"},{"family":"Gokhale","given":"Maya"},{"family":"Peng","given":"Ivy"}],"issued":{"date-parts":[[2025,10]]}}},{"id":"B5Q9E3C9","uris":["http://zotero.org/users/5591478/items/B5Q9E3C9"],"itemData":{"id":"B5Q9E3C9","type":"paper-conference","container-title":"2025 IEEE International Parallel and Distributed Processing Symposium Workshops (IPDPSW)","DOI":"10.1109/ipdpsw66978.2025.00013","note":"Citation Key: Huebner25\narXiv: 2502.05317","page":"45-54","publisher":"IEEE","title":"Apple vs. Oranges: Evaluating the Apple Silicon M-Series SoCs for HPC Performance and Efficiency","URL":"https://doi.org/10.1109/ipdpsw66978.2025.00013","author":[{"family":"Hübner","given":"Paul"},{"family":"Hu","given":"Andong"},{"family":"Peng","given":"Ivy"},{"family":"Markidis","given":"Stefano"}],"issued":{"date-parts":[[2025,6,3]]}}},{"id":"9RHUAUDT","uris":["http://zotero.org/users/5591478/items/9RHUAUDT"],"itemData":{"id":"9RHUAUDT","type":"paper-conference","collection-title":"DaMoN ’26","container-title":"Proceedings of the 22nd International Workshop on Data Management on New Hardware","DOI":"10.1145/3789237.3809127","note":"Citation Key: Beischl26","page":"1-10","publisher":"ACM","title":"Evaluating Apple Silicon for Data Processing","URL":"https://doi.org/10.1145/3789237.3809127","author":[{"family":"Beischl","given":"Alexander"},{"family":"Morozov","given":"Mykola"},{"family":"Jungmair","given":"Michael"},{"family":"Haussmann","given":"Lukas"},{"family":"Neumann","given":"Thomas"}],"issued":{"date-parts":[[2026,5]]}}}],"schema":"https://github.com/citation-style-language/schema/raw/master/csl-citation.json"} </w:instrText>
       </w:r>
       <w:r>
         <w:fldChar w:fldCharType="separate"/>
@@ -997,7 +997,7 @@
         <w:fldChar w:fldCharType="begin"/>
       </w:r>
       <w:r>
-        <w:instrText xml:space="preserve"> ADDIN ZOTERO_ITEM CSL_CITATION {"citationID":"bdd12aee","properties":{"formattedCitation":"[3, 4, 13]","plainCitation":"[3, 4, 13]","noteIndex":0},"citationItems":[{"id":"B5Q9E3C9","uris":["http://zotero.org/users/5591478/items/B5Q9E3C9"],"itemData":{"id":"B5Q9E3C9","type":"article","DOI":"10.48550/arXiv.2502.05317","note":"Citation Key: Huebner25","number":"arXiv:2502.05317","publisher":"arXiv","title":"Apple vs. Oranges: Evaluating the Apple Silicon M-Series SoCs for HPC Performance and Efficiency","URL":"https://arxiv.org/abs/2502.05317","author":[{"family":"Hübner","given":"Paul"},{"family":"Hu","given":"Andong"},{"family":"Peng","given":"Ivy"},{"family":"Markidis","given":"Stefano"}],"issued":{"date-parts":[[2025]]}}},{"id":"9RHUAUDT","uris":["http://zotero.org/users/5591478/items/9RHUAUDT"],"itemData":{"id":"9RHUAUDT","type":"paper-conference","collection-title":"DaMoN ’26","container-title":"Proceedings of the 22nd International Workshop on Data Management on New Hardware","DOI":"10.1145/3789237.3809127","note":"Citation Key: Beischl26","page":"1-10","publisher":"ACM","title":"Evaluating Apple Silicon for Data Processing","URL":"https://doi.org/10.1145/3789237.3809127","author":[{"family":"Beischl","given":"Alexander"},{"family":"Morozov","given":"Mykola"},{"family":"Jungmair","given":"Michael"},{"family":"Haussmann","given":"Lukas"},{"family":"Neumann","given":"Thomas"}],"issued":{"date-parts":[[2026,5]]}}},{"id":"MFGDN9HN","uris":["http://zotero.org/users/5591478/items/MFGDN9HN"],"itemData":{"id":"MFGDN9HN","type":"article","DOI":"10.48550/arXiv.2501.14925","note":"Citation Key: Feng25","number":"arXiv:2501.14925","publisher":"arXiv","title":"Profiling Apple Silicon Performance for ML Training","URL":"https://arxiv.org/abs/2501.14925","author":[{"family":"Feng","given":"Dahua"},{"family":"Xu","given":"Zhiming"},{"family":"Wang","given":"Rongxiang"},{"family":"Lin","given":"Felix Xiaozhu"}],"issued":{"date-parts":[[2025]]}}}],"schema":"https://github.com/citation-style-language/schema/raw/master/csl-citation.json"} </w:instrText>
+        <w:instrText xml:space="preserve"> ADDIN ZOTERO_ITEM CSL_CITATION {"citationID":"bdd12aee","properties":{"formattedCitation":"[3, 4, 13]","plainCitation":"[3, 4, 13]","noteIndex":0},"citationItems":[{"id":"B5Q9E3C9","uris":["http://zotero.org/users/5591478/items/B5Q9E3C9"],"itemData":{"id":"B5Q9E3C9","type":"paper-conference","container-title":"2025 IEEE International Parallel and Distributed Processing Symposium Workshops (IPDPSW)","DOI":"10.1109/ipdpsw66978.2025.00013","note":"Citation Key: Huebner25\narXiv: 2502.05317","page":"45-54","publisher":"IEEE","title":"Apple vs. Oranges: Evaluating the Apple Silicon M-Series SoCs for HPC Performance and Efficiency","URL":"https://doi.org/10.1109/ipdpsw66978.2025.00013","author":[{"family":"Hübner","given":"Paul"},{"family":"Hu","given":"Andong"},{"family":"Peng","given":"Ivy"},{"family":"Markidis","given":"Stefano"}],"issued":{"date-parts":[[2025,6,3]]}}},{"id":"9RHUAUDT","uris":["http://zotero.org/users/5591478/items/9RHUAUDT"],"itemData":{"id":"9RHUAUDT","type":"paper-conference","collection-title":"DaMoN ’26","container-title":"Proceedings of the 22nd International Workshop on Data Management on New Hardware","DOI":"10.1145/3789237.3809127","note":"Citation Key: Beischl26","page":"1-10","publisher":"ACM","title":"Evaluating Apple Silicon for Data Processing","URL":"https://doi.org/10.1145/3789237.3809127","author":[{"family":"Beischl","given":"Alexander"},{"family":"Morozov","given":"Mykola"},{"family":"Jungmair","given":"Michael"},{"family":"Haussmann","given":"Lukas"},{"family":"Neumann","given":"Thomas"}],"issued":{"date-parts":[[2026,5]]}}},{"id":"MFGDN9HN","uris":["http://zotero.org/users/5591478/items/MFGDN9HN"],"itemData":{"id":"MFGDN9HN","type":"article","DOI":"10.48550/arXiv.2501.14925","note":"Citation Key: Feng25","number":"arXiv:2501.14925","publisher":"arXiv","title":"Profiling Apple Silicon Performance for ML Training","URL":"https://arxiv.org/abs/2501.14925","author":[{"family":"Feng","given":"Dahua"},{"family":"Xu","given":"Zhiming"},{"family":"Wang","given":"Rongxiang"},{"family":"Lin","given":"Felix Xiaozhu"}],"issued":{"date-parts":[[2025]]}}}],"schema":"https://github.com/citation-style-language/schema/raw/master/csl-citation.json"} </w:instrText>
       </w:r>
       <w:r>
         <w:fldChar w:fldCharType="separate"/>
@@ -1438,7 +1438,7 @@
               <w:jc w:val="left"/>
             </w:pPr>
             <w:r>
-              <w:t xml:space="preserve">Apple M5, 10 cores, unified memory</w:t>
+              <w:t xml:space="preserve">Apple M5, 10 cores, shared physical memory</w:t>
             </w:r>
           </w:p>
         </w:tc>
@@ -3198,7 +3198,7 @@
         <w:t xml:space="preserve">P-M5:</w:t>
       </w:r>
       <w:r>
-        <w:t xml:space="preserve"> MacBook Air 15" (Mac17,4), Apple M5 (4P + 6E CPU cores, 10 GPU cores), 24 GiB unified memory, macOS 26.6.2, on AC power, Low Power Mode off, fanless chassis.</w:t>
+        <w:t xml:space="preserve"> MacBook Air 15" (Mac17,4), Apple M5 (4P + 6E CPU cores, 10 GPU cores), 24 GiB of memory shared by the CPU and GPU (Apple's "unified memory"), macOS 26.6.2, on AC power, Low Power Mode off, fanless chassis.</w:t>
       </w:r>
     </w:p>
     <w:p>
@@ -7237,7 +7237,7 @@
         <w:tab/>
       </w:r>
       <w:r>
-        <w:t xml:space="preserve">Hübner P, Hu A, Peng I, Markidis S (2025) Apple vs. Oranges: Evaluating the Apple Silicon M-Series SoCs for HPC Performance and Efficiency</w:t>
+        <w:t xml:space="preserve">Hübner P, Hu A, Peng I, Markidis S (2025) Apple vs. Oranges: Evaluating the Apple Silicon M-Series SoCs for HPC Performance and Efficiency. In: 2025 IEEE International Parallel and Distributed Processing Symposium Workshops (IPDPSW). IEEE, pp 45–54</w:t>
       </w:r>
     </w:p>
     <w:p>

</xml_diff>

<commit_message>
Paper §12.2 item 5 + §1: 10-25 clock trace (2.7 vs 4.3-4.5 GHz; load speeds spin, slows block waits); three protocol responses open; docx rebuilt (Refresh test pending, Main's Word turn)
Co-Authored-By: Claude Opus 5.5 <noreply@anthropic.com>
</commit_message>
<xml_diff>
--- a/docs/paper/lightbound_jsc.docx
+++ b/docs/paper/lightbound_jsc.docx
@@ -582,14 +582,14 @@
         </w:numPr>
       </w:pPr>
       <w:r>
-        <w:t xml:space="preserve">A practical account of measurement hygiene for microsecond-scale GPU latency on a laptop-class SoC. Background GPU clients, CPU contention and an undetected dark wake cost us runs, and a shift of 100–280 µs in spin-wait round trips survived every power, display, wake, launch and scheduling condition we tried, until the processor clock explained most of it: on an otherwise idle laptop a lone spin-waiting thread runs slower than the same thread beside a background load (Sect. 12). </w:t>
+        <w:t xml:space="preserve">A practical account of measurement hygiene for microsecond-scale GPU latency on a laptop-class SoC. Background GPU clients, CPU contention and an undetected dark wake cost us runs, and a shift of 100–280 µs in spin-wait round trips survived every power, display, wake, launch and scheduling condition we tried, until the processor clock explained it: on an otherwise idle laptop a lone spin-waiting thread runs at 2.7 GHz, beside a two-thread background load at 4.3–4.5 GHz, and the load speeds spin waits but slows block waits (Sect. 12). </w:t>
       </w:r>
       <w:r>
         <w:rPr>
           <w:i/>
           <w:iCs/>
         </w:rPr>
-        <w:t xml:space="preserve">(evidence in hand; a per-thread clock trace and the protocol's response are open, 2026-10-23)</w:t>
+        <w:t xml:space="preserve">(evidence in hand, clock trace 2026-10-25; the protocol's response is open)</w:t>
       </w:r>
     </w:p>
     <w:p>
@@ -6795,7 +6795,16 @@
         <w:t xml:space="preserve">s1_copy</w:t>
       </w:r>
       <w:r>
-        <w:t xml:space="preserve"> 4 KiB cells closed only part of the gap. Across the eight runs the spin round trips correlate with the clock (r = −0.81 to −0.95 for five of the six empty and 4 KiB cells, −0.58 for the sixth) and only weakly with the share of CPU time spent on performance cores (−0.52 to +0.16 for the same cells), which an earlier series had suggested as the cause. The 1 MiB spin cells stayed +180–230 µs in all but one run, so they carry a second component, the slow 1 MiB read in spin mode, that the clock alone does not remove. Our reading, not yet confirmed by a per-thread clock trace (root-level power sampling during a run is planned): on an otherwise idle M5 the governor leaves a lone spin-waiting thread at about 2.2 GHz, and another process's load raises the clock that the benchmark thread then shares. The accepted series ran with the chassis at thermal state "fair", that is with the machine busier than during any of our checks, which would make "what changed" the machine's background activity rather than a setting. Consequences: the M5's idle spin-wait numbers (Sect. 5) are governor-dependent, and a quiet machine is not the fastest machine for them. Sect. 5's verdict does not depend on it: in the present state the M5's block-wait cells are still slower than the 3060 Ti's best path (</w:t>
+        <w:t xml:space="preserve"> 4 KiB cells closed only part of the gap. Across the eight runs the spin round trips correlate with the clock (r = −0.81 to −0.95 for five of the six empty and 4 KiB cells, −0.58 for the sixth) and only weakly with the share of CPU time spent on performance cores (−0.52 to +0.16 for the same cells), which an earlier series had suggested as the cause. The 1 MiB spin cells stayed +180–230 µs in all but one run of that series. A per-thread view came from root-level power sampling (</w:t>
+      </w:r>
+      <w:r>
+        <w:rPr>
+          <w:rStyle w:val="CodeChar"/>
+        </w:rPr>
+        <w:t xml:space="preserve">powermetrics</w:t>
+      </w:r>
+      <w:r>
+        <w:t xml:space="preserve">, CPU and GPU samplers, 250 ms) over four alternating runs on 2026-10-25: two with the benchmark alone and two beside a defined companion load of two busy threads. Alone, the spin-waiting thread migrated across the four performance cores, each about 30 % active, with the cluster at 2.7 GHz; the spin cells were again +65–268 µs slower than the accepted series. Beside the load, the cluster ran at 4.3–4.5 GHz and the spin cells returned to within 34 µs of the accepted series, the 1 MiB cells included (+4–20 µs), except three 4 KiB cells at +80–88 µs. So the 1 MiB component seen at 2.8–3.2 GHz is also a clock effect, at a higher clock. The GPU sat in its lowest performance state (338 MHz) in all four runs, so it does not separate the two conditions. The load had the opposite effect on block-wait cells: +85–96 µs at 4 KiB and +6–18 µs at 1 MiB, where they had matched or beaten the accepted series alone. The process-level counters are a weaker guide than the sampled cluster clock: they read 2.8 GHz for the slow solo runs of 2026-10-25, about the process clock at which the 2026-10-22 runs had already recovered. Our reading: on an otherwise idle M5 the governor leaves a lone spin-waiting thread at a low clock, and another process's load raises the clock that the benchmark thread then shares. Neither condition reproduces the accepted series as a whole (its 4 KiB block-wait cells match the solo runs, its spin-wait and 1 MiB block-wait cells the loaded ones), consistent with its having run under an uncontrolled background load: the chassis was at thermal state "fair", busier than during any of our checks. Consequences: the M5's spin- and block-wait numbers (Sect. 5) depend on the CPU-side load, in opposite directions, and a quiet machine is not the fastest machine for spin waits. Sect. 5's verdict does not depend on it: in the present state the M5's block-wait cells are still slower than the 3060 Ti's best path (</w:t>
       </w:r>
       <w:r>
         <w:rPr>
@@ -6804,7 +6813,7 @@
         <w:t xml:space="preserve">s2_direct</w:t>
       </w:r>
       <w:r>
-        <w:t xml:space="preserve"> 1 MiB, chained, p50 205–222 vs 145–161 µs; on the PC, block and spin wait differ by ≤ 6 µs). The interpolated crossover does depend on it: it rests on the M5's 1 MiB level and would move to smaller payloads if the present block-wait level held. Two responses are open: re-measure the idle reference in the present state and report the spin-wait cells as clock-dependent, or make a defined CPU-side companion load part of the microbenchmark condition, which is closer to the game, whose simulation thread never spins alone. No M5 extension series is measured before that decision.</w:t>
+        <w:t xml:space="preserve"> 1 MiB, chained, p50 205–222 vs 145–161 µs; on the PC, block and spin wait differ by ≤ 6 µs). The interpolated crossover does depend on it: it rests on the M5's 1 MiB level and would move to smaller payloads if the solo block-wait level held. Three responses are open: re-measure the reference with the machine idle and report the load dependence, make the defined companion load part of the microbenchmark condition (closer to the game, whose simulation thread never spins alone), or measure both as named conditions. No M5 extension series is measured before that decision.</w:t>
       </w:r>
     </w:p>
     <w:p>

</xml_diff>

<commit_message>
Paper: drop arXiv-only refs (Feng25, Maczan26, Cassagne25) per LAB.md, Main's call 10-26; §2 rephrased with Beischl26; docx 19 fields, 15 refs
Revert this commit to restore them. Note with DOIs and changed sentences in docs/STATUS.md.

Co-Authored-By: Claude Opus 5.5 <noreply@anthropic.com>
</commit_message>
<xml_diff>
--- a/docs/paper/lightbound_jsc.docx
+++ b/docs/paper/lightbound_jsc.docx
@@ -997,19 +997,19 @@
         <w:fldChar w:fldCharType="begin"/>
       </w:r>
       <w:r>
-        <w:instrText xml:space="preserve"> ADDIN ZOTERO_ITEM CSL_CITATION {"citationID":"bdd12aee","properties":{"formattedCitation":"[3, 4, 13]","plainCitation":"[3, 4, 13]","noteIndex":0},"citationItems":[{"id":"B5Q9E3C9","uris":["http://zotero.org/users/5591478/items/B5Q9E3C9"],"itemData":{"id":"B5Q9E3C9","type":"paper-conference","container-title":"2025 IEEE International Parallel and Distributed Processing Symposium Workshops (IPDPSW)","DOI":"10.1109/ipdpsw66978.2025.00013","note":"Citation Key: Huebner25\narXiv: 2502.05317","page":"45-54","publisher":"IEEE","title":"Apple vs. Oranges: Evaluating the Apple Silicon M-Series SoCs for HPC Performance and Efficiency","URL":"https://doi.org/10.1109/ipdpsw66978.2025.00013","author":[{"family":"Hübner","given":"Paul"},{"family":"Hu","given":"Andong"},{"family":"Peng","given":"Ivy"},{"family":"Markidis","given":"Stefano"}],"issued":{"date-parts":[[2025,6,3]]}}},{"id":"9RHUAUDT","uris":["http://zotero.org/users/5591478/items/9RHUAUDT"],"itemData":{"id":"9RHUAUDT","type":"paper-conference","collection-title":"DaMoN ’26","container-title":"Proceedings of the 22nd International Workshop on Data Management on New Hardware","DOI":"10.1145/3789237.3809127","note":"Citation Key: Beischl26","page":"1-10","publisher":"ACM","title":"Evaluating Apple Silicon for Data Processing","URL":"https://doi.org/10.1145/3789237.3809127","author":[{"family":"Beischl","given":"Alexander"},{"family":"Morozov","given":"Mykola"},{"family":"Jungmair","given":"Michael"},{"family":"Haussmann","given":"Lukas"},{"family":"Neumann","given":"Thomas"}],"issued":{"date-parts":[[2026,5]]}}},{"id":"MFGDN9HN","uris":["http://zotero.org/users/5591478/items/MFGDN9HN"],"itemData":{"id":"MFGDN9HN","type":"article","DOI":"10.48550/arXiv.2501.14925","note":"Citation Key: Feng25","number":"arXiv:2501.14925","publisher":"arXiv","title":"Profiling Apple Silicon Performance for ML Training","URL":"https://arxiv.org/abs/2501.14925","author":[{"family":"Feng","given":"Dahua"},{"family":"Xu","given":"Zhiming"},{"family":"Wang","given":"Rongxiang"},{"family":"Lin","given":"Felix Xiaozhu"}],"issued":{"date-parts":[[2025]]}}}],"schema":"https://github.com/citation-style-language/schema/raw/master/csl-citation.json"} </w:instrText>
+        <w:instrText xml:space="preserve"> ADDIN ZOTERO_ITEM CSL_CITATION {"citationID":"48378a89","properties":{"formattedCitation":"[3, 4]","plainCitation":"[3, 4]","noteIndex":0},"citationItems":[{"id":"B5Q9E3C9","uris":["http://zotero.org/users/5591478/items/B5Q9E3C9"],"itemData":{"id":"B5Q9E3C9","type":"paper-conference","container-title":"2025 IEEE International Parallel and Distributed Processing Symposium Workshops (IPDPSW)","DOI":"10.1109/ipdpsw66978.2025.00013","note":"Citation Key: Huebner25\narXiv: 2502.05317","page":"45-54","publisher":"IEEE","title":"Apple vs. Oranges: Evaluating the Apple Silicon M-Series SoCs for HPC Performance and Efficiency","URL":"https://doi.org/10.1109/ipdpsw66978.2025.00013","author":[{"family":"Hübner","given":"Paul"},{"family":"Hu","given":"Andong"},{"family":"Peng","given":"Ivy"},{"family":"Markidis","given":"Stefano"}],"issued":{"date-parts":[[2025,6,3]]}}},{"id":"9RHUAUDT","uris":["http://zotero.org/users/5591478/items/9RHUAUDT"],"itemData":{"id":"9RHUAUDT","type":"paper-conference","collection-title":"DaMoN ’26","container-title":"Proceedings of the 22nd International Workshop on Data Management on New Hardware","DOI":"10.1145/3789237.3809127","note":"Citation Key: Beischl26","page":"1-10","publisher":"ACM","title":"Evaluating Apple Silicon for Data Processing","URL":"https://doi.org/10.1145/3789237.3809127","author":[{"family":"Beischl","given":"Alexander"},{"family":"Morozov","given":"Mykola"},{"family":"Jungmair","given":"Michael"},{"family":"Haussmann","given":"Lukas"},{"family":"Neumann","given":"Thomas"}],"issued":{"date-parts":[[2026,5]]}}}],"schema":"https://github.com/citation-style-language/schema/raw/master/csl-citation.json"} </w:instrText>
       </w:r>
       <w:r>
         <w:fldChar w:fldCharType="separate"/>
       </w:r>
       <w:r>
-        <w:t xml:space="preserve">[3, 4, 13]</w:t>
+        <w:t xml:space="preserve">[3, 4]</w:t>
       </w:r>
       <w:r>
         <w:fldChar w:fldCharType="end"/>
       </w:r>
       <w:r>
-        <w:t xml:space="preserve"> look at ML training, HPC kernels and databases.</w:t>
+        <w:t xml:space="preserve"> look at HPC kernels and databases.</w:t>
       </w:r>
     </w:p>
     <w:p>
@@ -1021,36 +1021,6 @@
         </w:numPr>
       </w:pPr>
       <w:r>
-        <w:t xml:space="preserve">Feng et al. </w:t>
-      </w:r>
-      <w:r>
-        <w:fldChar w:fldCharType="begin"/>
-      </w:r>
-      <w:r>
-        <w:instrText xml:space="preserve"> ADDIN ZOTERO_ITEM CSL_CITATION {"citationID":"0f0bdfed","properties":{"formattedCitation":"[13]","plainCitation":"[13]","noteIndex":0},"citationItems":[{"id":"MFGDN9HN","uris":["http://zotero.org/users/5591478/items/MFGDN9HN"],"itemData":{"id":"MFGDN9HN","type":"article","DOI":"10.48550/arXiv.2501.14925","note":"Citation Key: Feng25","number":"arXiv:2501.14925","publisher":"arXiv","title":"Profiling Apple Silicon Performance for ML Training","URL":"https://arxiv.org/abs/2501.14925","author":[{"family":"Feng","given":"Dahua"},{"family":"Xu","given":"Zhiming"},{"family":"Wang","given":"Rongxiang"},{"family":"Lin","given":"Felix Xiaozhu"}],"issued":{"date-parts":[[2025]]}}}],"schema":"https://github.com/citation-style-language/schema/raw/master/csl-citation.json"} </w:instrText>
-      </w:r>
-      <w:r>
-        <w:fldChar w:fldCharType="separate"/>
-      </w:r>
-      <w:r>
-        <w:t xml:space="preserve">[13]</w:t>
-      </w:r>
-      <w:r>
-        <w:fldChar w:fldCharType="end"/>
-      </w:r>
-      <w:r>
-        <w:t xml:space="preserve"> already point to kernel launch time as a factor in the gap with NVIDIA.</w:t>
-      </w:r>
-    </w:p>
-    <w:p>
-      <w:pPr>
-        <w:pStyle w:val="ListParagraph"/>
-        <w:numPr>
-          <w:ilvl w:val="1"/>
-          <w:numId w:val="1"/>
-        </w:numPr>
-      </w:pPr>
-      <w:r>
         <w:t xml:space="preserve">None measures repeated round trips within a real-time frame budget, or the GPU power-state effect we see in the CPU→GPU hand-off (Sect. 5, Sect. 6).</w:t>
       </w:r>
     </w:p>
@@ -1067,46 +1037,28 @@
           <w:b/>
           <w:bCs/>
         </w:rPr>
-        <w:t xml:space="preserve">Launch and dispatch overhead are known to be tens of µs, but measured one way.</w:t>
-      </w:r>
-      <w:r>
-        <w:t xml:space="preserve"> Maczan </w:t>
+        <w:t xml:space="preserve">Launch overhead is known to be tens of µs, but measured one way.</w:t>
+      </w:r>
+      <w:r>
+        <w:t xml:space="preserve"> On Apple Silicon, a Metal kernel costs tens of µs to encode and dispatch before it starts </w:t>
       </w:r>
       <w:r>
         <w:fldChar w:fldCharType="begin"/>
       </w:r>
       <w:r>
-        <w:instrText xml:space="preserve"> ADDIN ZOTERO_ITEM CSL_CITATION {"citationID":"b34883b6","properties":{"formattedCitation":"[14]","plainCitation":"[14]","noteIndex":0},"citationItems":[{"id":"Q7E37WC4","uris":["http://zotero.org/users/5591478/items/Q7E37WC4"],"itemData":{"id":"Q7E37WC4","type":"article","DOI":"10.48550/arXiv.2608.08730","note":"Citation Key: Maczan26","number":"arXiv:2608.08730","publisher":"arXiv","title":"Measuring and Reducing WebGPU Dispatch Overhead for LLM Inference","URL":"https://arxiv.org/abs/2608.08730","author":[{"family":"Maczan","given":"Jędrzej"}],"issued":{"date-parts":[[2026]]}}}],"schema":"https://github.com/citation-style-language/schema/raw/master/csl-citation.json"} </w:instrText>
+        <w:instrText xml:space="preserve"> ADDIN ZOTERO_ITEM CSL_CITATION {"citationID":"d369a427","properties":{"formattedCitation":"[4]","plainCitation":"[4]","noteIndex":0},"citationItems":[{"id":"9RHUAUDT","uris":["http://zotero.org/users/5591478/items/9RHUAUDT"],"itemData":{"id":"9RHUAUDT","type":"paper-conference","collection-title":"DaMoN ’26","container-title":"Proceedings of the 22nd International Workshop on Data Management on New Hardware","DOI":"10.1145/3789237.3809127","note":"Citation Key: Beischl26","page":"1-10","publisher":"ACM","title":"Evaluating Apple Silicon for Data Processing","URL":"https://doi.org/10.1145/3789237.3809127","author":[{"family":"Beischl","given":"Alexander"},{"family":"Morozov","given":"Mykola"},{"family":"Jungmair","given":"Michael"},{"family":"Haussmann","given":"Lukas"},{"family":"Neumann","given":"Thomas"}],"issued":{"date-parts":[[2026,5]]}}}],"schema":"https://github.com/citation-style-language/schema/raw/master/csl-citation.json"} </w:instrText>
       </w:r>
       <w:r>
         <w:fldChar w:fldCharType="separate"/>
       </w:r>
       <w:r>
-        <w:t xml:space="preserve">[14]</w:t>
+        <w:t xml:space="preserve">[4]</w:t>
       </w:r>
       <w:r>
         <w:fldChar w:fldCharType="end"/>
       </w:r>
       <w:r>
-        <w:t xml:space="preserve"> separates the marginal cost of a dispatch (24–36 µs Vulkan, 32–71 µs Metal) from the synchronization that a naive single-op timing folds in (450 of 497 µs). Cassagne et al. </w:t>
-      </w:r>
-      <w:r>
-        <w:fldChar w:fldCharType="begin"/>
-      </w:r>
-      <w:r>
-        <w:instrText xml:space="preserve"> ADDIN ZOTERO_ITEM CSL_CITATION {"citationID":"dba1fdf3","properties":{"formattedCitation":"[15]","plainCitation":"[15]","noteIndex":0},"citationItems":[{"id":"TE2TJ63A","uris":["http://zotero.org/users/5591478/items/TE2TJ63A"],"itemData":{"id":"TE2TJ63A","type":"article","DOI":"10.48550/arXiv.2508.10481","note":"Citation Key: Cassagne25","number":"arXiv:2508.10481","publisher":"arXiv","title":"Dalek: An Unconventional and Energy-Aware Heterogeneous Cluster","URL":"https://arxiv.org/abs/2508.10481","author":[{"family":"Cassagne","given":"Adrien"},{"family":"Amiot","given":"Noé"},{"family":"Bouyer","given":"Manuel"}],"issued":{"date-parts":[[2025]]}}}],"schema":"https://github.com/citation-style-language/schema/raw/master/csl-citation.json"} </w:instrText>
-      </w:r>
-      <w:r>
-        <w:fldChar w:fldCharType="separate"/>
-      </w:r>
-      <w:r>
-        <w:t xml:space="preserve">[15]</w:t>
-      </w:r>
-      <w:r>
-        <w:fldChar w:fldCharType="end"/>
-      </w:r>
-      <w:r>
-        <w:t xml:space="preserve"> report host-to-kernel-start latency from ≈ 5 µs (RTX 4090) to 35–40 µs (Intel iGPUs). Both measure the CPU→GPU direction only. Our round trip is exactly the part they exclude: the full hand-off in both directions, repeated within a frame, which is what a game pays for each K.</w:t>
+        <w:t xml:space="preserve">. Such figures cover the CPU→GPU direction only. Our round trip adds what they leave out: the full hand-off in both directions, repeated within a frame, which is what a game pays for each K.</w:t>
       </w:r>
     </w:p>
     <w:p>
@@ -1131,13 +1083,13 @@
         <w:fldChar w:fldCharType="begin"/>
       </w:r>
       <w:r>
-        <w:instrText xml:space="preserve"> ADDIN ZOTERO_ITEM CSL_CITATION {"citationID":"2dc5e099","properties":{"formattedCitation":"[16, 17]","plainCitation":"[16, 17]","noteIndex":0},"citationItems":[{"id":"JH7NE5WJ","uris":["http://zotero.org/users/5591478/items/JH7NE5WJ"],"itemData":{"id":"JH7NE5WJ","type":"paper-conference","container-title":"2025 IEEE International Parallel and Distributed Processing Symposium Workshops (IPDPSW)","DOI":"10.1109/ipdpsw66978.2025.00133","note":"Citation Key: Velicka25","page":"830-839","publisher":"IEEE","title":"Methodology for GPU Frequency Switching Latency Measurement","URL":"https://doi.org/10.1109/ipdpsw66978.2025.00133","author":[{"family":"Velicka","given":"Daniel"},{"family":"Vysocky","given":"Ondrej"},{"family":"Riha","given":"Lubomir"}],"issued":{"date-parts":[[2025,6]]}}},{"id":"63M2D7IM","uris":["http://zotero.org/users/5591478/items/63M2D7IM"],"itemData":{"id":"63M2D7IM","type":"article-journal","container-title":"Future Generation Computer Systems","DOI":"10.1016/j.future.2025.108331","ISSN":"0167-739X","note":"Citation Key: Velicka26","page":"108331","title":"An in-depth study of GPU frequency-scaling latency and its optimization on modern architectures","URL":"https://doi.org/10.1016/j.future.2025.108331","volume":"179","author":[{"family":"Velicka","given":"Daniel"},{"family":"Vysocky","given":"Ondrej"},{"family":"Yasal","given":"Osman"},{"family":"Riha","given":"Lubomir"}],"issued":{"date-parts":[[2026,6]]}}}],"schema":"https://github.com/citation-style-language/schema/raw/master/csl-citation.json"} </w:instrText>
+        <w:instrText xml:space="preserve"> ADDIN ZOTERO_ITEM CSL_CITATION {"citationID":"c7ce173e","properties":{"formattedCitation":"[13, 14]","plainCitation":"[13, 14]","noteIndex":0},"citationItems":[{"id":"JH7NE5WJ","uris":["http://zotero.org/users/5591478/items/JH7NE5WJ"],"itemData":{"id":"JH7NE5WJ","type":"paper-conference","container-title":"2025 IEEE International Parallel and Distributed Processing Symposium Workshops (IPDPSW)","DOI":"10.1109/ipdpsw66978.2025.00133","note":"Citation Key: Velicka25","page":"830-839","publisher":"IEEE","title":"Methodology for GPU Frequency Switching Latency Measurement","URL":"https://doi.org/10.1109/ipdpsw66978.2025.00133","author":[{"family":"Velicka","given":"Daniel"},{"family":"Vysocky","given":"Ondrej"},{"family":"Riha","given":"Lubomir"}],"issued":{"date-parts":[[2025,6]]}}},{"id":"63M2D7IM","uris":["http://zotero.org/users/5591478/items/63M2D7IM"],"itemData":{"id":"63M2D7IM","type":"article-journal","container-title":"Future Generation Computer Systems","DOI":"10.1016/j.future.2025.108331","ISSN":"0167-739X","note":"Citation Key: Velicka26","page":"108331","title":"An in-depth study of GPU frequency-scaling latency and its optimization on modern architectures","URL":"https://doi.org/10.1016/j.future.2025.108331","volume":"179","author":[{"family":"Velicka","given":"Daniel"},{"family":"Vysocky","given":"Ondrej"},{"family":"Yasal","given":"Osman"},{"family":"Riha","given":"Lubomir"}],"issued":{"date-parts":[[2026,6]]}}}],"schema":"https://github.com/citation-style-language/schema/raw/master/csl-citation.json"} </w:instrText>
       </w:r>
       <w:r>
         <w:fldChar w:fldCharType="separate"/>
       </w:r>
       <w:r>
-        <w:t xml:space="preserve">[16, 17]</w:t>
+        <w:t xml:space="preserve">[13, 14]</w:t>
       </w:r>
       <w:r>
         <w:fldChar w:fldCharType="end"/>
@@ -1168,13 +1120,13 @@
         <w:fldChar w:fldCharType="begin"/>
       </w:r>
       <w:r>
-        <w:instrText xml:space="preserve"> ADDIN ZOTERO_ITEM CSL_CITATION {"citationID":"04c680c3","properties":{"formattedCitation":"[18]","plainCitation":"[18]","noteIndex":0},"citationItems":[{"id":"HHZZZEFU","uris":["http://zotero.org/users/5591478/items/HHZZZEFU"],"itemData":{"id":"HHZZZEFU","type":"article-journal","container-title":"Simulation Modelling Practice and Theory","DOI":"10.1016/j.simpat.2022.102691","ISSN":"1569-190X","note":"Citation Key: Skrzypczak23","page":"102691","title":"Efficient parallel implementation of crowd simulation using a hybrid CPU+GPU high performance computing system","URL":"https://doi.org/10.1016/j.simpat.2022.102691","volume":"123","author":[{"family":"Skrzypczak","given":"Jakub"},{"family":"Czarnul","given":"Paweł"}],"issued":{"date-parts":[[2023,2]]}}}],"schema":"https://github.com/citation-style-language/schema/raw/master/csl-citation.json"} </w:instrText>
+        <w:instrText xml:space="preserve"> ADDIN ZOTERO_ITEM CSL_CITATION {"citationID":"4d083ff2","properties":{"formattedCitation":"[15]","plainCitation":"[15]","noteIndex":0},"citationItems":[{"id":"HHZZZEFU","uris":["http://zotero.org/users/5591478/items/HHZZZEFU"],"itemData":{"id":"HHZZZEFU","type":"article-journal","container-title":"Simulation Modelling Practice and Theory","DOI":"10.1016/j.simpat.2022.102691","ISSN":"1569-190X","note":"Citation Key: Skrzypczak23","page":"102691","title":"Efficient parallel implementation of crowd simulation using a hybrid CPU+GPU high performance computing system","URL":"https://doi.org/10.1016/j.simpat.2022.102691","volume":"123","author":[{"family":"Skrzypczak","given":"Jakub"},{"family":"Czarnul","given":"Paweł"}],"issued":{"date-parts":[[2023,2]]}}}],"schema":"https://github.com/citation-style-language/schema/raw/master/csl-citation.json"} </w:instrText>
       </w:r>
       <w:r>
         <w:fldChar w:fldCharType="separate"/>
       </w:r>
       <w:r>
-        <w:t xml:space="preserve">[18]</w:t>
+        <w:t xml:space="preserve">[15]</w:t>
       </w:r>
       <w:r>
         <w:fldChar w:fldCharType="end"/>
@@ -7386,7 +7338,7 @@
         <w:tab/>
       </w:r>
       <w:r>
-        <w:t xml:space="preserve">Feng D, Xu Z, Wang R, Lin FX (2025) Profiling Apple Silicon Performance for ML Training</w:t>
+        <w:t xml:space="preserve">Velicka D, Vysocky O, Riha L (2025) Methodology for GPU Frequency Switching Latency Measurement. In: 2025 IEEE International Parallel and Distributed Processing Symposium Workshops (IPDPSW). IEEE, pp 830–839</w:t>
       </w:r>
     </w:p>
     <w:p>
@@ -7400,7 +7352,7 @@
         <w:tab/>
       </w:r>
       <w:r>
-        <w:t xml:space="preserve">Maczan J (2026) Measuring and Reducing WebGPU Dispatch Overhead for LLM Inference</w:t>
+        <w:t xml:space="preserve">Velicka D, Vysocky O, Yasal O, Riha L (2026) An in-depth study of GPU frequency-scaling latency and its optimization on modern architectures. Future Generation Computer Systems 179:108331. https://doi.org/10.1016/j.future.2025.108331</w:t>
       </w:r>
     </w:p>
     <w:p>
@@ -7409,48 +7361,6 @@
       </w:pPr>
       <w:r>
         <w:t xml:space="preserve">15.</w:t>
-      </w:r>
-      <w:r>
-        <w:tab/>
-      </w:r>
-      <w:r>
-        <w:t xml:space="preserve">Cassagne A, Amiot N, Bouyer M (2025) Dalek: An Unconventional and Energy-Aware Heterogeneous Cluster</w:t>
-      </w:r>
-    </w:p>
-    <w:p>
-      <w:pPr>
-        <w:pStyle w:val="Bibliography"/>
-      </w:pPr>
-      <w:r>
-        <w:t xml:space="preserve">16.</w:t>
-      </w:r>
-      <w:r>
-        <w:tab/>
-      </w:r>
-      <w:r>
-        <w:t xml:space="preserve">Velicka D, Vysocky O, Riha L (2025) Methodology for GPU Frequency Switching Latency Measurement. In: 2025 IEEE International Parallel and Distributed Processing Symposium Workshops (IPDPSW). IEEE, pp 830–839</w:t>
-      </w:r>
-    </w:p>
-    <w:p>
-      <w:pPr>
-        <w:pStyle w:val="Bibliography"/>
-      </w:pPr>
-      <w:r>
-        <w:t xml:space="preserve">17.</w:t>
-      </w:r>
-      <w:r>
-        <w:tab/>
-      </w:r>
-      <w:r>
-        <w:t xml:space="preserve">Velicka D, Vysocky O, Yasal O, Riha L (2026) An in-depth study of GPU frequency-scaling latency and its optimization on modern architectures. Future Generation Computer Systems 179:108331. https://doi.org/10.1016/j.future.2025.108331</w:t>
-      </w:r>
-    </w:p>
-    <w:p>
-      <w:pPr>
-        <w:pStyle w:val="Bibliography"/>
-      </w:pPr>
-      <w:r>
-        <w:t xml:space="preserve">18.</w:t>
       </w:r>
       <w:r>
         <w:tab/>

</xml_diff>